<commit_message>
Uploaded a screenshot to show the URL in sample1 being defanged
</commit_message>
<xml_diff>
--- a/Task 2 Report.docx
+++ b/Task 2 Report.docx
@@ -913,2258 +913,28 @@
       <w:r>
         <w:br w:type="page"/>
       </w:r>
+      <w:r>
+        <w:lastRenderedPageBreak/>
+        <w:br w:type="page"/>
+      </w:r>
     </w:p>
     <w:p>
       <w:pPr>
         <w:pStyle w:val="Heading1"/>
         <w:shd w:val="clear" w:color="auto" w:fill="FFC9C9"/>
       </w:pPr>
-      <w:bookmarkStart w:id="0" w:name="_Toc233653134"/>
       <w:r>
         <w:lastRenderedPageBreak/>
-        <w:t>Executive Summary</w:t>
-      </w:r>
-      <w:bookmarkEnd w:id="0"/>
-    </w:p>
-    <w:p>
-      <w:pPr>
-        <w:pStyle w:val="Heading3"/>
-      </w:pPr>
-      <w:bookmarkStart w:id="1" w:name="_Toc233653135"/>
-      <w:r>
-        <w:t>Purpose of Assessment</w:t>
-      </w:r>
-      <w:bookmarkEnd w:id="1"/>
-    </w:p>
-    <w:p>
-      <w:r>
-        <w:t xml:space="preserve">The </w:t>
-      </w:r>
-      <w:r>
-        <w:t>purpose</w:t>
-      </w:r>
-      <w:r>
-        <w:t xml:space="preserve"> of this assessment was to evaluate the security posture of the OWASP Juice Shop demo application using passive, non-intrusive techniques. </w:t>
-      </w:r>
-      <w:r>
-        <w:t>T</w:t>
-      </w:r>
-      <w:r>
-        <w:t>he assessment focused on identifying publicly visible security weaknesses without attempting to exploit any vulnerabilities.</w:t>
+        <w:t>Sample 1: Credit Union</w:t>
       </w:r>
     </w:p>
     <w:p>
       <w:r>
-        <w:t>The assessment was conducted using network scanning, HTTP security header analysis, browser developer tools, and HTTPS configuration review.</w:t>
-      </w:r>
-    </w:p>
-    <w:p>
-      <w:r>
-        <w:t>Overall, the website demonstrated several positive security controls, including the use of HTTPS and certain browser security headers. However, several missing security headers and exposed network services were identified that could increase the application's attack surface if left unaddressed.</w:t>
-      </w:r>
-    </w:p>
-    <w:p/>
-    <w:p/>
-    <w:p/>
-    <w:p>
-      <w:pPr>
-        <w:pStyle w:val="Heading1"/>
-        <w:shd w:val="clear" w:color="auto" w:fill="FFC4C4"/>
-      </w:pPr>
-      <w:bookmarkStart w:id="2" w:name="_Toc233653136"/>
-      <w:r>
-        <w:t>Scope</w:t>
-      </w:r>
-      <w:bookmarkEnd w:id="2"/>
-    </w:p>
-    <w:p>
-      <w:pPr>
-        <w:rPr>
-          <w:b/>
-          <w:bCs/>
-          <w:sz w:val="28"/>
-          <w:szCs w:val="28"/>
-        </w:rPr>
-      </w:pPr>
-      <w:r>
-        <w:rPr>
-          <w:b/>
-          <w:bCs/>
-          <w:sz w:val="28"/>
-          <w:szCs w:val="28"/>
-        </w:rPr>
-        <w:t xml:space="preserve">Target Website </w:t>
-      </w:r>
-    </w:p>
-    <w:p>
-      <w:pPr>
-        <w:rPr>
-          <w:color w:val="7E1232" w:themeColor="accent2" w:themeShade="80"/>
-        </w:rPr>
-      </w:pPr>
-      <w:hyperlink r:id="rId9" w:anchor="/" w:history="1">
-        <w:r>
-          <w:rPr>
-            <w:rStyle w:val="Hyperlink"/>
-            <w:color w:val="7E1232" w:themeColor="accent2" w:themeShade="80"/>
-          </w:rPr>
-          <w:t>https://demo.owasp-juice.shop/#/</w:t>
-        </w:r>
-      </w:hyperlink>
-    </w:p>
-    <w:p>
-      <w:pPr>
-        <w:rPr>
-          <w:b/>
-          <w:bCs/>
-          <w:color w:val="000000" w:themeColor="text1"/>
-          <w:sz w:val="28"/>
-          <w:szCs w:val="28"/>
-        </w:rPr>
-      </w:pPr>
-      <w:r>
-        <w:rPr>
-          <w:b/>
-          <w:bCs/>
-          <w:color w:val="000000" w:themeColor="text1"/>
-          <w:sz w:val="28"/>
-          <w:szCs w:val="28"/>
-        </w:rPr>
-        <w:t xml:space="preserve">Assessment Type </w:t>
-      </w:r>
-    </w:p>
-    <w:p>
-      <w:pPr>
-        <w:rPr>
-          <w:color w:val="000000" w:themeColor="text1"/>
-        </w:rPr>
-      </w:pPr>
-      <w:r>
-        <w:rPr>
-          <w:color w:val="000000" w:themeColor="text1"/>
-        </w:rPr>
-        <w:t>Read Only Vulnerability Assessment</w:t>
-      </w:r>
-    </w:p>
-    <w:p>
-      <w:pPr>
-        <w:rPr>
-          <w:b/>
-          <w:bCs/>
-          <w:sz w:val="28"/>
-          <w:szCs w:val="28"/>
-        </w:rPr>
-      </w:pPr>
-      <w:r>
-        <w:rPr>
-          <w:b/>
-          <w:bCs/>
-          <w:sz w:val="28"/>
-          <w:szCs w:val="28"/>
-        </w:rPr>
-        <w:t>Included Activities:</w:t>
-      </w:r>
-    </w:p>
-    <w:p>
-      <w:pPr>
-        <w:pStyle w:val="ListParagraph"/>
-        <w:numPr>
-          <w:ilvl w:val="0"/>
-          <w:numId w:val="85"/>
-        </w:numPr>
-      </w:pPr>
-      <w:r>
-        <w:t>Network port scanning</w:t>
-      </w:r>
-    </w:p>
-    <w:p>
-      <w:pPr>
-        <w:pStyle w:val="ListParagraph"/>
-        <w:numPr>
-          <w:ilvl w:val="0"/>
-          <w:numId w:val="85"/>
-        </w:numPr>
-      </w:pPr>
-      <w:r>
-        <w:t>HTTP security header analysis</w:t>
-      </w:r>
-    </w:p>
-    <w:p>
-      <w:pPr>
-        <w:pStyle w:val="ListParagraph"/>
-        <w:numPr>
-          <w:ilvl w:val="0"/>
-          <w:numId w:val="85"/>
-        </w:numPr>
-      </w:pPr>
-      <w:r>
-        <w:t>Browser response header inspection</w:t>
-      </w:r>
-    </w:p>
-    <w:p>
-      <w:pPr>
-        <w:pStyle w:val="ListParagraph"/>
-        <w:numPr>
-          <w:ilvl w:val="0"/>
-          <w:numId w:val="85"/>
-        </w:numPr>
-      </w:pPr>
-      <w:r>
-        <w:t>SSL/TLS configuration review</w:t>
-      </w:r>
-    </w:p>
-    <w:p>
-      <w:pPr>
-        <w:rPr>
-          <w:b/>
-          <w:bCs/>
-          <w:sz w:val="28"/>
-          <w:szCs w:val="28"/>
-        </w:rPr>
-      </w:pPr>
-      <w:r>
-        <w:rPr>
-          <w:b/>
-          <w:bCs/>
-          <w:sz w:val="28"/>
-          <w:szCs w:val="28"/>
-        </w:rPr>
-        <w:t>Excluded Activities:</w:t>
-      </w:r>
-    </w:p>
-    <w:p>
-      <w:pPr>
-        <w:pStyle w:val="ListParagraph"/>
-        <w:numPr>
-          <w:ilvl w:val="0"/>
-          <w:numId w:val="86"/>
-        </w:numPr>
-      </w:pPr>
-      <w:r>
-        <w:t>Exploitation</w:t>
-      </w:r>
-    </w:p>
-    <w:p>
-      <w:pPr>
-        <w:pStyle w:val="ListParagraph"/>
-        <w:numPr>
-          <w:ilvl w:val="0"/>
-          <w:numId w:val="86"/>
-        </w:numPr>
-      </w:pPr>
-      <w:r>
-        <w:t>Brute force attacks</w:t>
-      </w:r>
-    </w:p>
-    <w:p>
-      <w:pPr>
-        <w:pStyle w:val="ListParagraph"/>
-        <w:numPr>
-          <w:ilvl w:val="0"/>
-          <w:numId w:val="86"/>
-        </w:numPr>
-      </w:pPr>
-      <w:r>
-        <w:t>Authentication bypass</w:t>
-      </w:r>
-    </w:p>
-    <w:p>
-      <w:pPr>
-        <w:pStyle w:val="ListParagraph"/>
-        <w:numPr>
-          <w:ilvl w:val="0"/>
-          <w:numId w:val="86"/>
-        </w:numPr>
-      </w:pPr>
-      <w:r>
-        <w:t>Denial of Service attacks</w:t>
-      </w:r>
-    </w:p>
-    <w:p>
-      <w:pPr>
-        <w:pStyle w:val="ListParagraph"/>
-        <w:numPr>
-          <w:ilvl w:val="0"/>
-          <w:numId w:val="86"/>
-        </w:numPr>
-      </w:pPr>
-      <w:r>
-        <w:t>Any intrusive testing</w:t>
-      </w:r>
-    </w:p>
-    <w:p>
-      <w:r>
-        <w:br w:type="page"/>
-      </w:r>
-    </w:p>
-    <w:p>
-      <w:pPr>
-        <w:pStyle w:val="Heading1"/>
-        <w:shd w:val="clear" w:color="auto" w:fill="FFC4C4"/>
-      </w:pPr>
-      <w:bookmarkStart w:id="3" w:name="_Toc233653137"/>
-      <w:r>
-        <w:lastRenderedPageBreak/>
-        <w:t>Methodology</w:t>
-      </w:r>
-      <w:bookmarkEnd w:id="3"/>
-      <w:r>
-        <w:t xml:space="preserve"> </w:t>
-      </w:r>
-    </w:p>
-    <w:p>
-      <w:r>
-        <w:t xml:space="preserve">This assessment followed a structured process that was </w:t>
-      </w:r>
-      <w:r>
-        <w:t xml:space="preserve">inspired by the guidelines </w:t>
-      </w:r>
-    </w:p>
-    <w:p>
-      <w:pPr>
-        <w:pStyle w:val="ListParagraph"/>
-        <w:numPr>
-          <w:ilvl w:val="0"/>
-          <w:numId w:val="88"/>
-        </w:numPr>
-      </w:pPr>
-      <w:r>
-        <w:t>Selected a publicly accessible web application suitable for ethical security assessment.</w:t>
-      </w:r>
-    </w:p>
-    <w:p>
-      <w:pPr>
-        <w:pStyle w:val="ListParagraph"/>
-        <w:numPr>
-          <w:ilvl w:val="0"/>
-          <w:numId w:val="88"/>
-        </w:numPr>
-      </w:pPr>
-      <w:r>
-        <w:t>Performed a network scan using Nmap to identify publicly exposed services.</w:t>
-      </w:r>
-    </w:p>
-    <w:p>
-      <w:pPr>
-        <w:pStyle w:val="ListParagraph"/>
-        <w:numPr>
-          <w:ilvl w:val="0"/>
-          <w:numId w:val="88"/>
-        </w:numPr>
-      </w:pPr>
-      <w:r>
-        <w:t>Inspected HTTP response headers using browser developer tools.</w:t>
-      </w:r>
-    </w:p>
-    <w:p>
-      <w:pPr>
-        <w:pStyle w:val="ListParagraph"/>
-        <w:numPr>
-          <w:ilvl w:val="0"/>
-          <w:numId w:val="88"/>
-        </w:numPr>
-      </w:pPr>
-      <w:r>
-        <w:t>Analysed</w:t>
-      </w:r>
-      <w:r>
-        <w:t xml:space="preserve"> implemented and missing security headers using SecurityHeaders.com.</w:t>
-      </w:r>
-    </w:p>
-    <w:p>
-      <w:pPr>
-        <w:pStyle w:val="ListParagraph"/>
-        <w:numPr>
-          <w:ilvl w:val="0"/>
-          <w:numId w:val="88"/>
-        </w:numPr>
-      </w:pPr>
-      <w:r>
-        <w:t>Documented findings, classified risks, and developed remediation recommendations.</w:t>
-      </w:r>
-    </w:p>
-    <w:p/>
-    <w:p/>
-    <w:p/>
-    <w:p>
-      <w:pPr>
-        <w:pStyle w:val="Heading1"/>
-        <w:shd w:val="clear" w:color="auto" w:fill="FFC4C4"/>
-      </w:pPr>
-      <w:bookmarkStart w:id="4" w:name="_Toc233653138"/>
-      <w:r>
-        <w:t>Tools Used</w:t>
-      </w:r>
-      <w:bookmarkEnd w:id="4"/>
-      <w:r>
-        <w:t xml:space="preserve"> </w:t>
-      </w:r>
-    </w:p>
-    <w:tbl>
-      <w:tblPr>
-        <w:tblStyle w:val="TableGrid"/>
-        <w:tblW w:w="0" w:type="auto"/>
-        <w:tblLook w:val="04A0" w:firstRow="1" w:lastRow="0" w:firstColumn="1" w:lastColumn="0" w:noHBand="0" w:noVBand="1"/>
-      </w:tblPr>
-      <w:tblGrid>
-        <w:gridCol w:w="4508"/>
-        <w:gridCol w:w="4508"/>
-      </w:tblGrid>
-      <w:tr>
-        <w:tc>
-          <w:tcPr>
-            <w:tcW w:w="4508" w:type="dxa"/>
-          </w:tcPr>
-          <w:p>
-            <w:pPr>
-              <w:jc w:val="center"/>
-              <w:rPr>
-                <w:b/>
-                <w:bCs/>
-              </w:rPr>
-            </w:pPr>
-            <w:r>
-              <w:rPr>
-                <w:b/>
-                <w:bCs/>
-              </w:rPr>
-              <w:t>Tool</w:t>
-            </w:r>
-          </w:p>
-        </w:tc>
-        <w:tc>
-          <w:tcPr>
-            <w:tcW w:w="4508" w:type="dxa"/>
-          </w:tcPr>
-          <w:p>
-            <w:pPr>
-              <w:jc w:val="center"/>
-              <w:rPr>
-                <w:b/>
-                <w:bCs/>
-              </w:rPr>
-            </w:pPr>
-            <w:r>
-              <w:rPr>
-                <w:b/>
-                <w:bCs/>
-              </w:rPr>
-              <w:t>Purpose</w:t>
-            </w:r>
-          </w:p>
-        </w:tc>
-      </w:tr>
-      <w:tr>
-        <w:tc>
-          <w:tcPr>
-            <w:tcW w:w="4508" w:type="dxa"/>
-          </w:tcPr>
-          <w:p>
-            <w:r>
-              <w:t xml:space="preserve">Nmap </w:t>
-            </w:r>
-          </w:p>
-        </w:tc>
-        <w:tc>
-          <w:tcPr>
-            <w:tcW w:w="4508" w:type="dxa"/>
-          </w:tcPr>
-          <w:p>
-            <w:r>
-              <w:t>Network port scanning</w:t>
-            </w:r>
-          </w:p>
-        </w:tc>
-      </w:tr>
-      <w:tr>
-        <w:tc>
-          <w:tcPr>
-            <w:tcW w:w="4508" w:type="dxa"/>
-          </w:tcPr>
-          <w:p>
-            <w:r>
-              <w:t>SecurityHeaders.com</w:t>
-            </w:r>
-          </w:p>
-        </w:tc>
-        <w:tc>
-          <w:tcPr>
-            <w:tcW w:w="4508" w:type="dxa"/>
-          </w:tcPr>
-          <w:p>
-            <w:r>
-              <w:t>HTTP security header analysis</w:t>
-            </w:r>
-          </w:p>
-        </w:tc>
-      </w:tr>
-      <w:tr>
-        <w:tc>
-          <w:tcPr>
-            <w:tcW w:w="4508" w:type="dxa"/>
-          </w:tcPr>
-          <w:p>
-            <w:r>
-              <w:t>Browser Developer Tools</w:t>
-            </w:r>
-          </w:p>
-        </w:tc>
-        <w:tc>
-          <w:tcPr>
-            <w:tcW w:w="4508" w:type="dxa"/>
-          </w:tcPr>
-          <w:p>
-            <w:r>
-              <w:t>Response header inspection</w:t>
-            </w:r>
-          </w:p>
-        </w:tc>
-      </w:tr>
-      <w:tr>
-        <w:tc>
-          <w:tcPr>
-            <w:tcW w:w="4508" w:type="dxa"/>
-          </w:tcPr>
-          <w:p>
-            <w:r>
-              <w:t xml:space="preserve">Microsoft Word </w:t>
-            </w:r>
-          </w:p>
-        </w:tc>
-        <w:tc>
-          <w:tcPr>
-            <w:tcW w:w="4508" w:type="dxa"/>
-          </w:tcPr>
-          <w:p>
-            <w:r>
-              <w:t>Report desig</w:t>
-            </w:r>
-            <w:r>
-              <w:t>n</w:t>
-            </w:r>
-          </w:p>
-        </w:tc>
-      </w:tr>
-    </w:tbl>
-    <w:p>
-      <w:pPr>
-        <w:pStyle w:val="Heading1"/>
-        <w:jc w:val="left"/>
-      </w:pPr>
-    </w:p>
-    <w:p>
-      <w:pPr>
-        <w:rPr>
-          <w:rFonts w:ascii="Hello Christmas" w:eastAsiaTheme="majorEastAsia" w:hAnsi="Hello Christmas" w:cstheme="majorBidi"/>
-          <w:b/>
-          <w:i/>
-          <w:color w:val="893A49"/>
-          <w:sz w:val="56"/>
-          <w:szCs w:val="40"/>
-          <w:u w:val="single"/>
-          <w14:textOutline w14:w="9525" w14:cap="rnd" w14:cmpd="sng" w14:algn="ctr">
-            <w14:noFill/>
-            <w14:prstDash w14:val="solid"/>
-            <w14:bevel/>
-          </w14:textOutline>
-        </w:rPr>
-      </w:pPr>
-      <w:r>
-        <w:br w:type="page"/>
-      </w:r>
-    </w:p>
-    <w:p>
-      <w:pPr>
-        <w:pStyle w:val="Heading1"/>
-        <w:shd w:val="clear" w:color="auto" w:fill="FFC4C4"/>
-      </w:pPr>
-      <w:bookmarkStart w:id="5" w:name="_Toc233653139"/>
-      <w:r>
-        <w:lastRenderedPageBreak/>
-        <w:t>Assessment Findings</w:t>
-      </w:r>
-      <w:bookmarkEnd w:id="5"/>
-    </w:p>
-    <w:tbl>
-      <w:tblPr>
-        <w:tblStyle w:val="TableGrid"/>
-        <w:tblW w:w="10774" w:type="dxa"/>
-        <w:tblInd w:w="-147" w:type="dxa"/>
-        <w:tblLayout w:type="fixed"/>
-        <w:tblLook w:val="04A0" w:firstRow="1" w:lastRow="0" w:firstColumn="1" w:lastColumn="0" w:noHBand="0" w:noVBand="1"/>
-      </w:tblPr>
-      <w:tblGrid>
-        <w:gridCol w:w="5529"/>
-        <w:gridCol w:w="5245"/>
-      </w:tblGrid>
-      <w:tr>
-        <w:tc>
-          <w:tcPr>
-            <w:tcW w:w="5529" w:type="dxa"/>
-          </w:tcPr>
-          <w:p>
-            <w:pPr>
-              <w:rPr>
-                <w:b/>
-                <w:bCs/>
-                <w:color w:val="7E1232" w:themeColor="accent2" w:themeShade="80"/>
-                <w:sz w:val="20"/>
-                <w:szCs w:val="20"/>
-              </w:rPr>
-            </w:pPr>
-            <w:r>
-              <w:rPr>
-                <w:b/>
-                <w:bCs/>
-                <w:color w:val="7E1232" w:themeColor="accent2" w:themeShade="80"/>
-                <w:sz w:val="24"/>
-                <w:szCs w:val="24"/>
-              </w:rPr>
-              <w:t>1. Exposed Network Services</w:t>
-            </w:r>
-          </w:p>
-          <w:p/>
-          <w:p>
-            <w:pPr>
-              <w:shd w:val="clear" w:color="auto" w:fill="FFC4C4"/>
-              <w:rPr>
-                <w:b/>
-                <w:bCs/>
-              </w:rPr>
-            </w:pPr>
-            <w:r>
-              <w:rPr>
-                <w:b/>
-                <w:bCs/>
-              </w:rPr>
-              <w:t>Risk Level:</w:t>
-            </w:r>
-          </w:p>
-          <w:p>
-            <w:r>
-              <w:t>Medium</w:t>
-            </w:r>
-          </w:p>
-          <w:p/>
-          <w:p>
-            <w:pPr>
-              <w:shd w:val="clear" w:color="auto" w:fill="FFC4C4"/>
-              <w:rPr>
-                <w:b/>
-                <w:bCs/>
-              </w:rPr>
-            </w:pPr>
-            <w:r>
-              <w:rPr>
-                <w:b/>
-                <w:bCs/>
-              </w:rPr>
-              <w:t>Description:</w:t>
-            </w:r>
-          </w:p>
-          <w:p>
-            <w:r>
-              <w:t>S</w:t>
-            </w:r>
-            <w:r>
-              <w:t>can identified several publicly accessible services running on the target server.</w:t>
-            </w:r>
-          </w:p>
-          <w:p>
-            <w:pPr>
-              <w:shd w:val="clear" w:color="auto" w:fill="FFDDDD"/>
-              <w:rPr>
-                <w:color w:val="7E1232" w:themeColor="accent2" w:themeShade="80"/>
-                <w:sz w:val="20"/>
-                <w:szCs w:val="20"/>
-              </w:rPr>
-            </w:pPr>
-            <w:r>
-              <w:rPr>
-                <w:color w:val="7E1232" w:themeColor="accent2" w:themeShade="80"/>
-              </w:rPr>
-              <w:t>Open Ports Detected</w:t>
-            </w:r>
-            <w:r>
-              <w:rPr>
-                <w:color w:val="7E1232" w:themeColor="accent2" w:themeShade="80"/>
-                <w:sz w:val="20"/>
-                <w:szCs w:val="20"/>
-              </w:rPr>
-              <w:t>:</w:t>
-            </w:r>
-          </w:p>
-          <w:p>
-            <w:pPr>
-              <w:pStyle w:val="ListParagraph"/>
-              <w:numPr>
-                <w:ilvl w:val="0"/>
-                <w:numId w:val="90"/>
-              </w:numPr>
-            </w:pPr>
-            <w:r>
-              <w:t>FTP (21)</w:t>
-            </w:r>
-          </w:p>
-          <w:p>
-            <w:pPr>
-              <w:pStyle w:val="ListParagraph"/>
-              <w:numPr>
-                <w:ilvl w:val="0"/>
-                <w:numId w:val="90"/>
-              </w:numPr>
-            </w:pPr>
-            <w:r>
-              <w:t>HTTP (80)</w:t>
-            </w:r>
-          </w:p>
-          <w:p>
-            <w:pPr>
-              <w:pStyle w:val="ListParagraph"/>
-              <w:numPr>
-                <w:ilvl w:val="0"/>
-                <w:numId w:val="90"/>
-              </w:numPr>
-            </w:pPr>
-            <w:r>
-              <w:t>HTTPS (443)</w:t>
-            </w:r>
-          </w:p>
-          <w:p>
-            <w:pPr>
-              <w:pStyle w:val="ListParagraph"/>
-              <w:numPr>
-                <w:ilvl w:val="0"/>
-                <w:numId w:val="90"/>
-              </w:numPr>
-            </w:pPr>
-            <w:r>
-              <w:t>HTTP Proxy (8080)</w:t>
-            </w:r>
-          </w:p>
-          <w:p>
-            <w:pPr>
-              <w:pStyle w:val="ListParagraph"/>
-              <w:numPr>
-                <w:ilvl w:val="0"/>
-                <w:numId w:val="90"/>
-              </w:numPr>
-            </w:pPr>
-            <w:proofErr w:type="gramStart"/>
-            <w:r>
-              <w:t>Port(</w:t>
-            </w:r>
-            <w:proofErr w:type="gramEnd"/>
-            <w:r>
-              <w:t>1723 was filtered)</w:t>
-            </w:r>
-          </w:p>
-          <w:p>
-            <w:pPr>
-              <w:shd w:val="clear" w:color="auto" w:fill="FFC4C4"/>
-              <w:rPr>
-                <w:b/>
-                <w:bCs/>
-              </w:rPr>
-            </w:pPr>
-            <w:r>
-              <w:rPr>
-                <w:b/>
-                <w:bCs/>
-              </w:rPr>
-              <w:t>Impact:</w:t>
-            </w:r>
-          </w:p>
-          <w:p>
-            <w:r>
-              <w:t>Every publicly accessible service increases the organization's attack surface. While not all exposed services represent vulnerabilities, unnecessary services may provide attackers with additional opportunities for reconnaissance or exploitation if they become misconfigured or outdated.</w:t>
-            </w:r>
-          </w:p>
-          <w:p/>
-          <w:p>
-            <w:pPr>
-              <w:shd w:val="clear" w:color="auto" w:fill="FFC4C4"/>
-              <w:rPr>
-                <w:b/>
-                <w:bCs/>
-              </w:rPr>
-            </w:pPr>
-            <w:r>
-              <w:rPr>
-                <w:b/>
-                <w:bCs/>
-              </w:rPr>
-              <w:t>Evidence:</w:t>
-            </w:r>
-          </w:p>
-          <w:p>
-            <w:pPr>
-              <w:rPr>
-                <w:b/>
-                <w:bCs/>
-              </w:rPr>
-            </w:pPr>
-            <w:r>
-              <w:rPr>
-                <w:b/>
-                <w:bCs/>
-                <w:noProof/>
-              </w:rPr>
-              <w:drawing>
-                <wp:inline distT="0" distB="0" distL="0" distR="0" wp14:anchorId="3AA51454" wp14:editId="6210B03F">
-                  <wp:extent cx="3086100" cy="1244600"/>
-                  <wp:effectExtent l="0" t="0" r="0" b="0"/>
-                  <wp:docPr id="1913431913" name="Picture 2"/>
-                  <wp:cNvGraphicFramePr>
-                    <a:graphicFrameLocks xmlns:a="http://schemas.openxmlformats.org/drawingml/2006/main" noChangeAspect="1"/>
-                  </wp:cNvGraphicFramePr>
-                  <a:graphic xmlns:a="http://schemas.openxmlformats.org/drawingml/2006/main">
-                    <a:graphicData uri="http://schemas.openxmlformats.org/drawingml/2006/picture">
-                      <pic:pic xmlns:pic="http://schemas.openxmlformats.org/drawingml/2006/picture">
-                        <pic:nvPicPr>
-                          <pic:cNvPr id="1913431913" name="Picture 1913431913"/>
-                          <pic:cNvPicPr/>
-                        </pic:nvPicPr>
-                        <pic:blipFill>
-                          <a:blip r:embed="rId10" cstate="print">
-                            <a:extLst>
-                              <a:ext uri="{28A0092B-C50C-407E-A947-70E740481C1C}">
-                                <a14:useLocalDpi xmlns:a14="http://schemas.microsoft.com/office/drawing/2010/main" val="0"/>
-                              </a:ext>
-                            </a:extLst>
-                          </a:blip>
-                          <a:stretch>
-                            <a:fillRect/>
-                          </a:stretch>
-                        </pic:blipFill>
-                        <pic:spPr>
-                          <a:xfrm>
-                            <a:off x="0" y="0"/>
-                            <a:ext cx="3086100" cy="1244600"/>
-                          </a:xfrm>
-                          <a:prstGeom prst="rect">
-                            <a:avLst/>
-                          </a:prstGeom>
-                        </pic:spPr>
-                      </pic:pic>
-                    </a:graphicData>
-                  </a:graphic>
-                </wp:inline>
-              </w:drawing>
-            </w:r>
-          </w:p>
-          <w:p/>
-          <w:p>
-            <w:pPr>
-              <w:shd w:val="clear" w:color="auto" w:fill="FFC4C4"/>
-              <w:rPr>
-                <w:b/>
-                <w:bCs/>
-              </w:rPr>
-            </w:pPr>
-            <w:r>
-              <w:rPr>
-                <w:b/>
-                <w:bCs/>
-              </w:rPr>
-              <w:t>Recommendation:</w:t>
-            </w:r>
-          </w:p>
-          <w:p>
-            <w:pPr>
-              <w:pStyle w:val="ListParagraph"/>
-              <w:numPr>
-                <w:ilvl w:val="0"/>
-                <w:numId w:val="91"/>
-              </w:numPr>
-            </w:pPr>
-            <w:r>
-              <w:t>Disable services that are not required.</w:t>
-            </w:r>
-          </w:p>
-          <w:p>
-            <w:pPr>
-              <w:pStyle w:val="ListParagraph"/>
-              <w:numPr>
-                <w:ilvl w:val="0"/>
-                <w:numId w:val="91"/>
-              </w:numPr>
-            </w:pPr>
-            <w:r>
-              <w:t>Restrict access to administrative services.</w:t>
-            </w:r>
-          </w:p>
-          <w:p>
-            <w:pPr>
-              <w:pStyle w:val="ListParagraph"/>
-              <w:numPr>
-                <w:ilvl w:val="0"/>
-                <w:numId w:val="91"/>
-              </w:numPr>
-            </w:pPr>
-            <w:r>
-              <w:t>Perform regular reviews of exposed network services.</w:t>
-            </w:r>
-          </w:p>
-          <w:p/>
-          <w:p/>
-        </w:tc>
-        <w:tc>
-          <w:tcPr>
-            <w:tcW w:w="5245" w:type="dxa"/>
-          </w:tcPr>
-          <w:p>
-            <w:pPr>
-              <w:rPr>
-                <w:b/>
-                <w:bCs/>
-                <w:color w:val="7E1232" w:themeColor="accent2" w:themeShade="80"/>
-              </w:rPr>
-            </w:pPr>
-            <w:r>
-              <w:rPr>
-                <w:b/>
-                <w:bCs/>
-                <w:color w:val="7E1232" w:themeColor="accent2" w:themeShade="80"/>
-              </w:rPr>
-              <w:t>2.</w:t>
-            </w:r>
-            <w:r>
-              <w:rPr>
-                <w:sz w:val="24"/>
-                <w:szCs w:val="24"/>
-              </w:rPr>
-              <w:t xml:space="preserve"> </w:t>
-            </w:r>
-            <w:r>
-              <w:rPr>
-                <w:b/>
-                <w:bCs/>
-                <w:color w:val="7E1232" w:themeColor="accent2" w:themeShade="80"/>
-                <w:sz w:val="24"/>
-                <w:szCs w:val="24"/>
-              </w:rPr>
-              <w:t>Missing Content Security Policy Header</w:t>
-            </w:r>
-          </w:p>
-          <w:p/>
-          <w:p>
-            <w:pPr>
-              <w:shd w:val="clear" w:color="auto" w:fill="FFC4C4"/>
-              <w:rPr>
-                <w:b/>
-                <w:bCs/>
-              </w:rPr>
-            </w:pPr>
-            <w:r>
-              <w:rPr>
-                <w:b/>
-                <w:bCs/>
-              </w:rPr>
-              <w:t>Risk Level:</w:t>
-            </w:r>
-          </w:p>
-          <w:p>
-            <w:r>
-              <w:t>Medium</w:t>
-            </w:r>
-          </w:p>
-          <w:p/>
-          <w:p>
-            <w:pPr>
-              <w:shd w:val="clear" w:color="auto" w:fill="FFC4C4"/>
-              <w:rPr>
-                <w:b/>
-                <w:bCs/>
-              </w:rPr>
-            </w:pPr>
-            <w:r>
-              <w:rPr>
-                <w:b/>
-                <w:bCs/>
-              </w:rPr>
-              <w:t>Description:</w:t>
-            </w:r>
-          </w:p>
-          <w:p>
-            <w:r>
-              <w:t>S</w:t>
-            </w:r>
-            <w:r>
-              <w:t xml:space="preserve">can </w:t>
-            </w:r>
-            <w:r>
-              <w:t>assessment identified that the website does not implement a Content Security Policy (CSP).</w:t>
-            </w:r>
-          </w:p>
-          <w:p>
-            <w:r>
-              <w:t>A CSP restricts which sources of content a browser is allowed to load, helping to mitigate attacks such as Cross Site Scripting (XSS).</w:t>
-            </w:r>
-          </w:p>
-          <w:p>
-            <w:pPr>
-              <w:shd w:val="clear" w:color="auto" w:fill="FFC4C4"/>
-              <w:rPr>
-                <w:b/>
-                <w:bCs/>
-              </w:rPr>
-            </w:pPr>
-            <w:r>
-              <w:rPr>
-                <w:b/>
-                <w:bCs/>
-              </w:rPr>
-              <w:t>Impact:</w:t>
-            </w:r>
-          </w:p>
-          <w:p>
-            <w:r>
-              <w:t xml:space="preserve">Without a Content Security Policy, attackers may have an easier opportunity to execute malicious scripts if an injection vulnerability exists elsewhere in the </w:t>
-            </w:r>
-            <w:proofErr w:type="gramStart"/>
-            <w:r>
-              <w:t>application.</w:t>
-            </w:r>
-            <w:r>
-              <w:t>.</w:t>
-            </w:r>
-            <w:proofErr w:type="gramEnd"/>
-          </w:p>
-          <w:p/>
-          <w:p>
-            <w:pPr>
-              <w:shd w:val="clear" w:color="auto" w:fill="FFC4C4"/>
-              <w:rPr>
-                <w:b/>
-                <w:bCs/>
-              </w:rPr>
-            </w:pPr>
-            <w:r>
-              <w:rPr>
-                <w:b/>
-                <w:bCs/>
-              </w:rPr>
-              <w:t>Evidence:</w:t>
-            </w:r>
-          </w:p>
-          <w:p>
-            <w:pPr>
-              <w:rPr>
-                <w:b/>
-                <w:bCs/>
-              </w:rPr>
-            </w:pPr>
-            <w:r>
-              <w:rPr>
-                <w:b/>
-                <w:bCs/>
-                <w:noProof/>
-              </w:rPr>
-              <w:drawing>
-                <wp:inline distT="0" distB="0" distL="0" distR="0" wp14:anchorId="20EEBE12" wp14:editId="7F18DD41">
-                  <wp:extent cx="3336226" cy="2023110"/>
-                  <wp:effectExtent l="0" t="0" r="0" b="0"/>
-                  <wp:docPr id="1158217142" name="Picture 3"/>
-                  <wp:cNvGraphicFramePr>
-                    <a:graphicFrameLocks xmlns:a="http://schemas.openxmlformats.org/drawingml/2006/main" noChangeAspect="1"/>
-                  </wp:cNvGraphicFramePr>
-                  <a:graphic xmlns:a="http://schemas.openxmlformats.org/drawingml/2006/main">
-                    <a:graphicData uri="http://schemas.openxmlformats.org/drawingml/2006/picture">
-                      <pic:pic xmlns:pic="http://schemas.openxmlformats.org/drawingml/2006/picture">
-                        <pic:nvPicPr>
-                          <pic:cNvPr id="1158217142" name="Picture 1158217142"/>
-                          <pic:cNvPicPr/>
-                        </pic:nvPicPr>
-                        <pic:blipFill>
-                          <a:blip r:embed="rId11">
-                            <a:extLst>
-                              <a:ext uri="{28A0092B-C50C-407E-A947-70E740481C1C}">
-                                <a14:useLocalDpi xmlns:a14="http://schemas.microsoft.com/office/drawing/2010/main" val="0"/>
-                              </a:ext>
-                            </a:extLst>
-                          </a:blip>
-                          <a:stretch>
-                            <a:fillRect/>
-                          </a:stretch>
-                        </pic:blipFill>
-                        <pic:spPr>
-                          <a:xfrm rot="10800000" flipH="1" flipV="1">
-                            <a:off x="0" y="0"/>
-                            <a:ext cx="3369801" cy="2043470"/>
-                          </a:xfrm>
-                          <a:prstGeom prst="rect">
-                            <a:avLst/>
-                          </a:prstGeom>
-                        </pic:spPr>
-                      </pic:pic>
-                    </a:graphicData>
-                  </a:graphic>
-                </wp:inline>
-              </w:drawing>
-            </w:r>
-          </w:p>
-          <w:p>
-            <w:pPr>
-              <w:shd w:val="clear" w:color="auto" w:fill="FFC4C4"/>
-              <w:rPr>
-                <w:b/>
-                <w:bCs/>
-              </w:rPr>
-            </w:pPr>
-            <w:r>
-              <w:rPr>
-                <w:b/>
-                <w:bCs/>
-              </w:rPr>
-              <w:t>Recommendation:</w:t>
-            </w:r>
-          </w:p>
-          <w:p>
-            <w:r>
-              <w:t>Implement a Content Security Policy that explicitly defines trusted sources for scripts, stylesheets, images, and other resources.</w:t>
-            </w:r>
-          </w:p>
-          <w:p/>
-        </w:tc>
-      </w:tr>
-      <w:tr>
-        <w:tc>
-          <w:tcPr>
-            <w:tcW w:w="5529" w:type="dxa"/>
-          </w:tcPr>
-          <w:p>
-            <w:pPr>
-              <w:rPr>
-                <w:b/>
-                <w:bCs/>
-                <w:color w:val="7E1232" w:themeColor="accent2" w:themeShade="80"/>
-              </w:rPr>
-            </w:pPr>
-            <w:r>
-              <w:rPr>
-                <w:b/>
-                <w:bCs/>
-                <w:color w:val="7E1232" w:themeColor="accent2" w:themeShade="80"/>
-              </w:rPr>
-              <w:t xml:space="preserve">3. </w:t>
-            </w:r>
-            <w:r>
-              <w:rPr>
-                <w:b/>
-                <w:bCs/>
-                <w:color w:val="7E1232" w:themeColor="accent2" w:themeShade="80"/>
-                <w:sz w:val="24"/>
-                <w:szCs w:val="24"/>
-              </w:rPr>
-              <w:t>Missing Referrer Policy Header</w:t>
-            </w:r>
-          </w:p>
-          <w:p/>
-          <w:p>
-            <w:pPr>
-              <w:shd w:val="clear" w:color="auto" w:fill="FFC4C4"/>
-              <w:rPr>
-                <w:b/>
-                <w:bCs/>
-              </w:rPr>
-            </w:pPr>
-            <w:r>
-              <w:rPr>
-                <w:b/>
-                <w:bCs/>
-              </w:rPr>
-              <w:t>Risk Level:</w:t>
-            </w:r>
-          </w:p>
-          <w:p>
-            <w:r>
-              <w:t>Low</w:t>
-            </w:r>
-          </w:p>
-          <w:p/>
-          <w:p>
-            <w:pPr>
-              <w:shd w:val="clear" w:color="auto" w:fill="FFC4C4"/>
-              <w:rPr>
-                <w:b/>
-                <w:bCs/>
-              </w:rPr>
-            </w:pPr>
-            <w:r>
-              <w:rPr>
-                <w:b/>
-                <w:bCs/>
-              </w:rPr>
-              <w:t>Description:</w:t>
-            </w:r>
-          </w:p>
-          <w:p>
-            <w:r>
-              <w:t>The Referrer Policy header was missing.</w:t>
-            </w:r>
-            <w:r>
-              <w:t xml:space="preserve"> </w:t>
-            </w:r>
-            <w:r>
-              <w:t>This header controls how much information browsers send when users follow links to other websites.</w:t>
-            </w:r>
-          </w:p>
-          <w:p/>
-          <w:p>
-            <w:pPr>
-              <w:shd w:val="clear" w:color="auto" w:fill="FFC4C4"/>
-              <w:rPr>
-                <w:b/>
-                <w:bCs/>
-              </w:rPr>
-            </w:pPr>
-            <w:r>
-              <w:rPr>
-                <w:b/>
-                <w:bCs/>
-              </w:rPr>
-              <w:t>Impact:</w:t>
-            </w:r>
-          </w:p>
-          <w:p>
-            <w:r>
-              <w:t>Sensitive information contained in URLs could unintentionally be shared with third party websites.</w:t>
-            </w:r>
-          </w:p>
-          <w:p>
-            <w:pPr>
-              <w:shd w:val="clear" w:color="auto" w:fill="FFC4C4"/>
-              <w:rPr>
-                <w:b/>
-                <w:bCs/>
-              </w:rPr>
-            </w:pPr>
-            <w:r>
-              <w:rPr>
-                <w:b/>
-                <w:bCs/>
-              </w:rPr>
-              <w:t>Evidence:</w:t>
-            </w:r>
-          </w:p>
-          <w:p>
-            <w:pPr>
-              <w:rPr>
-                <w:b/>
-                <w:bCs/>
-              </w:rPr>
-            </w:pPr>
-            <w:r>
-              <w:rPr>
-                <w:b/>
-                <w:bCs/>
-                <w:noProof/>
-              </w:rPr>
-              <w:lastRenderedPageBreak/>
-              <w:drawing>
-                <wp:inline distT="0" distB="0" distL="0" distR="0" wp14:anchorId="3F756158" wp14:editId="3D338FC3">
-                  <wp:extent cx="3205162" cy="2023110"/>
-                  <wp:effectExtent l="0" t="0" r="0" b="0"/>
-                  <wp:docPr id="474059156" name="Picture 3"/>
-                  <wp:cNvGraphicFramePr>
-                    <a:graphicFrameLocks xmlns:a="http://schemas.openxmlformats.org/drawingml/2006/main" noChangeAspect="1"/>
-                  </wp:cNvGraphicFramePr>
-                  <a:graphic xmlns:a="http://schemas.openxmlformats.org/drawingml/2006/main">
-                    <a:graphicData uri="http://schemas.openxmlformats.org/drawingml/2006/picture">
-                      <pic:pic xmlns:pic="http://schemas.openxmlformats.org/drawingml/2006/picture">
-                        <pic:nvPicPr>
-                          <pic:cNvPr id="1158217142" name="Picture 1158217142"/>
-                          <pic:cNvPicPr/>
-                        </pic:nvPicPr>
-                        <pic:blipFill>
-                          <a:blip r:embed="rId11">
-                            <a:extLst>
-                              <a:ext uri="{28A0092B-C50C-407E-A947-70E740481C1C}">
-                                <a14:useLocalDpi xmlns:a14="http://schemas.microsoft.com/office/drawing/2010/main" val="0"/>
-                              </a:ext>
-                            </a:extLst>
-                          </a:blip>
-                          <a:stretch>
-                            <a:fillRect/>
-                          </a:stretch>
-                        </pic:blipFill>
-                        <pic:spPr>
-                          <a:xfrm>
-                            <a:off x="0" y="0"/>
-                            <a:ext cx="3237227" cy="2043350"/>
-                          </a:xfrm>
-                          <a:prstGeom prst="rect">
-                            <a:avLst/>
-                          </a:prstGeom>
-                        </pic:spPr>
-                      </pic:pic>
-                    </a:graphicData>
-                  </a:graphic>
-                </wp:inline>
-              </w:drawing>
-            </w:r>
-          </w:p>
-          <w:p/>
-          <w:p>
-            <w:pPr>
-              <w:shd w:val="clear" w:color="auto" w:fill="FFC4C4"/>
-              <w:rPr>
-                <w:b/>
-                <w:bCs/>
-              </w:rPr>
-            </w:pPr>
-            <w:r>
-              <w:rPr>
-                <w:b/>
-                <w:bCs/>
-              </w:rPr>
-              <w:t>Recommendation:</w:t>
-            </w:r>
-          </w:p>
-          <w:p>
-            <w:r>
-              <w:t>Configure an appropriate Referrer Policy, such as</w:t>
-            </w:r>
-            <w:r>
-              <w:t xml:space="preserve"> </w:t>
-            </w:r>
-            <w:r>
-              <w:rPr>
-                <w:i/>
-                <w:iCs/>
-              </w:rPr>
-              <w:t>strict-origin-when-cross-origin.</w:t>
-            </w:r>
-            <w:r>
-              <w:t xml:space="preserve"> </w:t>
-            </w:r>
-          </w:p>
-        </w:tc>
-        <w:tc>
-          <w:tcPr>
-            <w:tcW w:w="5245" w:type="dxa"/>
-          </w:tcPr>
-          <w:p>
-            <w:pPr>
-              <w:rPr>
-                <w:b/>
-                <w:bCs/>
-                <w:color w:val="7E1232" w:themeColor="accent2" w:themeShade="80"/>
-              </w:rPr>
-            </w:pPr>
-            <w:r>
-              <w:rPr>
-                <w:b/>
-                <w:bCs/>
-                <w:color w:val="7E1232" w:themeColor="accent2" w:themeShade="80"/>
-              </w:rPr>
-              <w:lastRenderedPageBreak/>
-              <w:t>4</w:t>
-            </w:r>
-            <w:r>
-              <w:rPr>
-                <w:b/>
-                <w:bCs/>
-                <w:color w:val="7E1232" w:themeColor="accent2" w:themeShade="80"/>
-              </w:rPr>
-              <w:t xml:space="preserve">. </w:t>
-            </w:r>
-            <w:r>
-              <w:rPr>
-                <w:b/>
-                <w:bCs/>
-                <w:color w:val="7E1232" w:themeColor="accent2" w:themeShade="80"/>
-                <w:sz w:val="24"/>
-                <w:szCs w:val="24"/>
-              </w:rPr>
-              <w:t>Missing Permissions Policy Header</w:t>
-            </w:r>
-          </w:p>
-          <w:p/>
-          <w:p>
-            <w:pPr>
-              <w:shd w:val="clear" w:color="auto" w:fill="FFC4C4"/>
-              <w:rPr>
-                <w:b/>
-                <w:bCs/>
-              </w:rPr>
-            </w:pPr>
-            <w:r>
-              <w:rPr>
-                <w:b/>
-                <w:bCs/>
-              </w:rPr>
-              <w:t>Risk Level:</w:t>
-            </w:r>
-          </w:p>
-          <w:p>
-            <w:r>
-              <w:t>Low</w:t>
-            </w:r>
-          </w:p>
-          <w:p/>
-          <w:p>
-            <w:pPr>
-              <w:shd w:val="clear" w:color="auto" w:fill="FFC4C4"/>
-              <w:rPr>
-                <w:b/>
-                <w:bCs/>
-              </w:rPr>
-            </w:pPr>
-            <w:r>
-              <w:rPr>
-                <w:b/>
-                <w:bCs/>
-              </w:rPr>
-              <w:t>Description:</w:t>
-            </w:r>
-          </w:p>
-          <w:p>
-            <w:r>
-              <w:t xml:space="preserve">The Referrer Policy header was missing. </w:t>
-            </w:r>
-            <w:r>
-              <w:t xml:space="preserve">This header controls access to browser features </w:t>
-            </w:r>
-            <w:r>
-              <w:t>like such as camera, microphone, and geolocation.</w:t>
-            </w:r>
-          </w:p>
-          <w:p/>
-          <w:p>
-            <w:pPr>
-              <w:shd w:val="clear" w:color="auto" w:fill="FFC4C4"/>
-              <w:rPr>
-                <w:b/>
-                <w:bCs/>
-              </w:rPr>
-            </w:pPr>
-            <w:r>
-              <w:rPr>
-                <w:b/>
-                <w:bCs/>
-              </w:rPr>
-              <w:t>Impact:</w:t>
-            </w:r>
-          </w:p>
-          <w:p>
-            <w:r>
-              <w:t>Missing restrictions may allow unnecessary browser capabilities to remain available if future application functionality is introduced</w:t>
-            </w:r>
-            <w:r>
-              <w:t>.</w:t>
-            </w:r>
-          </w:p>
-          <w:p>
-            <w:pPr>
-              <w:shd w:val="clear" w:color="auto" w:fill="FFC4C4"/>
-              <w:rPr>
-                <w:b/>
-                <w:bCs/>
-              </w:rPr>
-            </w:pPr>
-            <w:r>
-              <w:rPr>
-                <w:b/>
-                <w:bCs/>
-              </w:rPr>
-              <w:t>Evidence:</w:t>
-            </w:r>
-          </w:p>
-          <w:p>
-            <w:pPr>
-              <w:rPr>
-                <w:b/>
-                <w:bCs/>
-              </w:rPr>
-            </w:pPr>
-            <w:r>
-              <w:rPr>
-                <w:b/>
-                <w:bCs/>
-                <w:noProof/>
-              </w:rPr>
-              <w:lastRenderedPageBreak/>
-              <w:drawing>
-                <wp:inline distT="0" distB="0" distL="0" distR="0" wp14:anchorId="1D0CFEED" wp14:editId="205404A5">
-                  <wp:extent cx="3466697" cy="2023110"/>
-                  <wp:effectExtent l="0" t="0" r="635" b="0"/>
-                  <wp:docPr id="2055210918" name="Picture 4"/>
-                  <wp:cNvGraphicFramePr>
-                    <a:graphicFrameLocks xmlns:a="http://schemas.openxmlformats.org/drawingml/2006/main" noChangeAspect="1"/>
-                  </wp:cNvGraphicFramePr>
-                  <a:graphic xmlns:a="http://schemas.openxmlformats.org/drawingml/2006/main">
-                    <a:graphicData uri="http://schemas.openxmlformats.org/drawingml/2006/picture">
-                      <pic:pic xmlns:pic="http://schemas.openxmlformats.org/drawingml/2006/picture">
-                        <pic:nvPicPr>
-                          <pic:cNvPr id="2055210918" name="Picture 2055210918"/>
-                          <pic:cNvPicPr/>
-                        </pic:nvPicPr>
-                        <pic:blipFill rotWithShape="1">
-                          <a:blip r:embed="rId12">
-                            <a:extLst>
-                              <a:ext uri="{28A0092B-C50C-407E-A947-70E740481C1C}">
-                                <a14:useLocalDpi xmlns:a14="http://schemas.microsoft.com/office/drawing/2010/main" val="0"/>
-                              </a:ext>
-                            </a:extLst>
-                          </a:blip>
-                          <a:srcRect b="46524"/>
-                          <a:stretch>
-                            <a:fillRect/>
-                          </a:stretch>
-                        </pic:blipFill>
-                        <pic:spPr bwMode="auto">
-                          <a:xfrm>
-                            <a:off x="0" y="0"/>
-                            <a:ext cx="3467964" cy="2023849"/>
-                          </a:xfrm>
-                          <a:prstGeom prst="rect">
-                            <a:avLst/>
-                          </a:prstGeom>
-                          <a:ln>
-                            <a:noFill/>
-                          </a:ln>
-                          <a:extLst>
-                            <a:ext uri="{53640926-AAD7-44D8-BBD7-CCE9431645EC}">
-                              <a14:shadowObscured xmlns:a14="http://schemas.microsoft.com/office/drawing/2010/main"/>
-                            </a:ext>
-                          </a:extLst>
-                        </pic:spPr>
-                      </pic:pic>
-                    </a:graphicData>
-                  </a:graphic>
-                </wp:inline>
-              </w:drawing>
-            </w:r>
-          </w:p>
-          <w:p/>
-          <w:p>
-            <w:pPr>
-              <w:shd w:val="clear" w:color="auto" w:fill="FFC4C4"/>
-              <w:rPr>
-                <w:b/>
-                <w:bCs/>
-              </w:rPr>
-            </w:pPr>
-            <w:r>
-              <w:rPr>
-                <w:b/>
-                <w:bCs/>
-              </w:rPr>
-              <w:t>Recommendation:</w:t>
-            </w:r>
-          </w:p>
-          <w:p>
-            <w:r>
-              <w:t>Implement a Permissions Policy that disables browser features not required by the application.</w:t>
-            </w:r>
-          </w:p>
-        </w:tc>
-      </w:tr>
-    </w:tbl>
-    <w:p/>
-    <w:tbl>
-      <w:tblPr>
-        <w:tblStyle w:val="TableGrid"/>
-        <w:tblW w:w="10349" w:type="dxa"/>
-        <w:tblInd w:w="-147" w:type="dxa"/>
-        <w:tblLook w:val="04A0" w:firstRow="1" w:lastRow="0" w:firstColumn="1" w:lastColumn="0" w:noHBand="0" w:noVBand="1"/>
-      </w:tblPr>
-      <w:tblGrid>
-        <w:gridCol w:w="10349"/>
-      </w:tblGrid>
-      <w:tr>
-        <w:tc>
-          <w:tcPr>
-            <w:tcW w:w="10349" w:type="dxa"/>
-          </w:tcPr>
-          <w:p>
-            <w:pPr>
-              <w:rPr>
-                <w:b/>
-                <w:bCs/>
-                <w:color w:val="7E1232" w:themeColor="accent2" w:themeShade="80"/>
-                <w:sz w:val="24"/>
-                <w:szCs w:val="24"/>
-              </w:rPr>
-            </w:pPr>
-            <w:r>
-              <w:rPr>
-                <w:b/>
-                <w:bCs/>
-                <w:color w:val="7E1232" w:themeColor="accent2" w:themeShade="80"/>
-                <w:sz w:val="24"/>
-                <w:szCs w:val="24"/>
-              </w:rPr>
-              <w:t>5. Website Accessible Over HTTP</w:t>
-            </w:r>
-          </w:p>
-          <w:p/>
-          <w:p>
-            <w:pPr>
-              <w:shd w:val="clear" w:color="auto" w:fill="FFC4C4"/>
-              <w:rPr>
-                <w:b/>
-                <w:bCs/>
-              </w:rPr>
-            </w:pPr>
-            <w:r>
-              <w:rPr>
-                <w:b/>
-                <w:bCs/>
-              </w:rPr>
-              <w:t>Risk Level:</w:t>
-            </w:r>
-          </w:p>
-          <w:p>
-            <w:r>
-              <w:t>Medium</w:t>
-            </w:r>
-          </w:p>
-          <w:p/>
-          <w:p>
-            <w:pPr>
-              <w:shd w:val="clear" w:color="auto" w:fill="FFC4C4"/>
-              <w:rPr>
-                <w:b/>
-                <w:bCs/>
-              </w:rPr>
-            </w:pPr>
-            <w:r>
-              <w:rPr>
-                <w:b/>
-                <w:bCs/>
-              </w:rPr>
-              <w:t>Description:</w:t>
-            </w:r>
-          </w:p>
-          <w:p>
-            <w:r>
-              <w:t>The assessment indicated that the website could be accessed over HTTP.</w:t>
-            </w:r>
-            <w:r>
-              <w:t xml:space="preserve"> </w:t>
-            </w:r>
-            <w:r>
-              <w:t>Although HTTPS is available, HTTP connections increase the possibility of unencrypted communication if users access the insecure version.</w:t>
-            </w:r>
-          </w:p>
-          <w:p/>
-          <w:p>
-            <w:pPr>
-              <w:shd w:val="clear" w:color="auto" w:fill="FFC4C4"/>
-              <w:rPr>
-                <w:b/>
-                <w:bCs/>
-              </w:rPr>
-            </w:pPr>
-            <w:r>
-              <w:rPr>
-                <w:b/>
-                <w:bCs/>
-              </w:rPr>
-              <w:t>Impact:</w:t>
-            </w:r>
-          </w:p>
-          <w:p>
-            <w:r>
-              <w:t>Users may unknowingly access the unencrypted version of the site, increasing the risk of interception during transmission</w:t>
-            </w:r>
-            <w:r>
-              <w:t>.</w:t>
-            </w:r>
-          </w:p>
-          <w:p/>
-          <w:p>
-            <w:pPr>
-              <w:shd w:val="clear" w:color="auto" w:fill="FFC4C4"/>
-              <w:rPr>
-                <w:b/>
-                <w:bCs/>
-              </w:rPr>
-            </w:pPr>
-            <w:r>
-              <w:rPr>
-                <w:b/>
-                <w:bCs/>
-              </w:rPr>
-              <w:t>Evidence:</w:t>
-            </w:r>
-          </w:p>
-          <w:p>
-            <w:pPr>
-              <w:rPr>
-                <w:b/>
-                <w:bCs/>
-              </w:rPr>
-            </w:pPr>
-            <w:r>
-              <w:rPr>
-                <w:b/>
-                <w:bCs/>
-                <w:noProof/>
-              </w:rPr>
-              <w:drawing>
-                <wp:inline distT="0" distB="0" distL="0" distR="0" wp14:anchorId="487496E9" wp14:editId="617D0601">
-                  <wp:extent cx="4150360" cy="2022974"/>
-                  <wp:effectExtent l="0" t="0" r="2540" b="0"/>
-                  <wp:docPr id="689139450" name="Picture 4"/>
-                  <wp:cNvGraphicFramePr>
-                    <a:graphicFrameLocks xmlns:a="http://schemas.openxmlformats.org/drawingml/2006/main" noChangeAspect="1"/>
-                  </wp:cNvGraphicFramePr>
-                  <a:graphic xmlns:a="http://schemas.openxmlformats.org/drawingml/2006/main">
-                    <a:graphicData uri="http://schemas.openxmlformats.org/drawingml/2006/picture">
-                      <pic:pic xmlns:pic="http://schemas.openxmlformats.org/drawingml/2006/picture">
-                        <pic:nvPicPr>
-                          <pic:cNvPr id="2055210918" name="Picture 2055210918"/>
-                          <pic:cNvPicPr/>
-                        </pic:nvPicPr>
-                        <pic:blipFill rotWithShape="1">
-                          <a:blip r:embed="rId12">
-                            <a:extLst>
-                              <a:ext uri="{28A0092B-C50C-407E-A947-70E740481C1C}">
-                                <a14:useLocalDpi xmlns:a14="http://schemas.microsoft.com/office/drawing/2010/main" val="0"/>
-                              </a:ext>
-                            </a:extLst>
-                          </a:blip>
-                          <a:srcRect b="46524"/>
-                          <a:stretch>
-                            <a:fillRect/>
-                          </a:stretch>
-                        </pic:blipFill>
-                        <pic:spPr bwMode="auto">
-                          <a:xfrm>
-                            <a:off x="0" y="0"/>
-                            <a:ext cx="4161384" cy="2028347"/>
-                          </a:xfrm>
-                          <a:prstGeom prst="rect">
-                            <a:avLst/>
-                          </a:prstGeom>
-                          <a:ln>
-                            <a:noFill/>
-                          </a:ln>
-                          <a:extLst>
-                            <a:ext uri="{53640926-AAD7-44D8-BBD7-CCE9431645EC}">
-                              <a14:shadowObscured xmlns:a14="http://schemas.microsoft.com/office/drawing/2010/main"/>
-                            </a:ext>
-                          </a:extLst>
-                        </pic:spPr>
-                      </pic:pic>
-                    </a:graphicData>
-                  </a:graphic>
-                </wp:inline>
-              </w:drawing>
-            </w:r>
-          </w:p>
-          <w:p/>
-          <w:p>
-            <w:pPr>
-              <w:shd w:val="clear" w:color="auto" w:fill="FFC4C4"/>
-              <w:rPr>
-                <w:b/>
-                <w:bCs/>
-              </w:rPr>
-            </w:pPr>
-            <w:r>
-              <w:rPr>
-                <w:b/>
-                <w:bCs/>
-              </w:rPr>
-              <w:t>Recommendation:</w:t>
-            </w:r>
-          </w:p>
-          <w:p>
-            <w:r>
-              <w:t>Redirect all HTTP traffic automatically to HTTPS and enable HTTP Strict Transport Security (HSTS)</w:t>
-            </w:r>
-            <w:r>
-              <w:t>.</w:t>
-            </w:r>
-          </w:p>
-        </w:tc>
-      </w:tr>
-    </w:tbl>
-    <w:p>
-      <w:pPr>
-        <w:pStyle w:val="Heading1"/>
-        <w:rPr>
-          <w:color w:val="7E1232" w:themeColor="accent2" w:themeShade="80"/>
-        </w:rPr>
-      </w:pPr>
-    </w:p>
-    <w:p>
-      <w:pPr>
-        <w:rPr>
-          <w:rFonts w:ascii="Hello Christmas" w:eastAsiaTheme="majorEastAsia" w:hAnsi="Hello Christmas" w:cstheme="majorBidi"/>
-          <w:b/>
-          <w:i/>
-          <w:color w:val="7E1232" w:themeColor="accent2" w:themeShade="80"/>
-          <w:sz w:val="56"/>
-          <w:szCs w:val="40"/>
-          <w:u w:val="single"/>
-          <w14:textOutline w14:w="9525" w14:cap="rnd" w14:cmpd="sng" w14:algn="ctr">
-            <w14:noFill/>
-            <w14:prstDash w14:val="solid"/>
-            <w14:bevel/>
-          </w14:textOutline>
-        </w:rPr>
-      </w:pPr>
-      <w:r>
-        <w:rPr>
-          <w:color w:val="7E1232" w:themeColor="accent2" w:themeShade="80"/>
-        </w:rPr>
-        <w:br w:type="page"/>
-      </w:r>
-    </w:p>
-    <w:p>
-      <w:pPr>
-        <w:pStyle w:val="Heading1"/>
-        <w:shd w:val="clear" w:color="auto" w:fill="FFC9C9"/>
-        <w:rPr>
-          <w:color w:val="7E1232" w:themeColor="accent2" w:themeShade="80"/>
-        </w:rPr>
-      </w:pPr>
-      <w:bookmarkStart w:id="6" w:name="_Toc233653140"/>
-      <w:r>
-        <w:rPr>
-          <w:color w:val="7E1232" w:themeColor="accent2" w:themeShade="80"/>
-        </w:rPr>
-        <w:lastRenderedPageBreak/>
-        <w:t>Positive Security Controls</w:t>
-      </w:r>
-      <w:bookmarkEnd w:id="6"/>
-    </w:p>
-    <w:p>
-      <w:r>
-        <w:t xml:space="preserve">Not all the findings were negative as the </w:t>
-      </w:r>
-      <w:r>
-        <w:t xml:space="preserve">scanned </w:t>
-      </w:r>
-      <w:r>
-        <w:t>results</w:t>
-      </w:r>
-      <w:r>
-        <w:t xml:space="preserve"> also showed several good security practices</w:t>
-      </w:r>
-      <w:r>
-        <w:t>:</w:t>
-      </w:r>
-    </w:p>
-    <w:p>
-      <w:pPr>
-        <w:pStyle w:val="ListParagraph"/>
-        <w:numPr>
-          <w:ilvl w:val="0"/>
-          <w:numId w:val="92"/>
-        </w:numPr>
-      </w:pPr>
-      <w:r>
-        <w:t xml:space="preserve">The security headers that were implemented were </w:t>
-      </w:r>
-      <w:r>
-        <w:t>X Content Type Options</w:t>
-      </w:r>
-      <w:r>
-        <w:t xml:space="preserve"> and </w:t>
-      </w:r>
-      <w:r>
-        <w:t>X Frame Options</w:t>
-      </w:r>
-      <w:r>
-        <w:t xml:space="preserve">. </w:t>
-      </w:r>
-    </w:p>
-    <w:p>
-      <w:pPr>
-        <w:pStyle w:val="ListParagraph"/>
-        <w:numPr>
-          <w:ilvl w:val="0"/>
-          <w:numId w:val="92"/>
-        </w:numPr>
-      </w:pPr>
-      <w:r>
-        <w:t>These headers help protect users against MIME type sniffing and clickjacking attacks.</w:t>
-      </w:r>
-    </w:p>
-    <w:p>
-      <w:pPr>
-        <w:pStyle w:val="ListParagraph"/>
-        <w:numPr>
-          <w:ilvl w:val="0"/>
-          <w:numId w:val="92"/>
-        </w:numPr>
-      </w:pPr>
-      <w:r>
-        <w:t>HTTPS was successfully configured, allowing encrypted communication between clients and the web application.</w:t>
-      </w:r>
-    </w:p>
-    <w:p>
-      <w:pPr>
-        <w:pStyle w:val="Heading1"/>
-        <w:shd w:val="clear" w:color="auto" w:fill="FFC4C4"/>
-      </w:pPr>
-      <w:bookmarkStart w:id="7" w:name="_Toc233653141"/>
-      <w:r>
-        <w:t>Risk Summary</w:t>
-      </w:r>
-      <w:bookmarkEnd w:id="7"/>
-    </w:p>
-    <w:tbl>
-      <w:tblPr>
-        <w:tblStyle w:val="TableGrid"/>
-        <w:tblW w:w="0" w:type="auto"/>
-        <w:tblLook w:val="04A0" w:firstRow="1" w:lastRow="0" w:firstColumn="1" w:lastColumn="0" w:noHBand="0" w:noVBand="1"/>
-      </w:tblPr>
-      <w:tblGrid>
-        <w:gridCol w:w="4508"/>
-        <w:gridCol w:w="4508"/>
-      </w:tblGrid>
-      <w:tr>
-        <w:tc>
-          <w:tcPr>
-            <w:tcW w:w="4508" w:type="dxa"/>
-            <w:shd w:val="clear" w:color="auto" w:fill="F1879B"/>
-          </w:tcPr>
-          <w:p>
-            <w:pPr>
-              <w:jc w:val="center"/>
-              <w:rPr>
-                <w:rFonts w:ascii="Times New Roman" w:hAnsi="Times New Roman"/>
-                <w:b/>
-                <w:bCs/>
-              </w:rPr>
-            </w:pPr>
-            <w:r>
-              <w:rPr>
-                <w:b/>
-                <w:bCs/>
-              </w:rPr>
-              <w:t>Finding</w:t>
-            </w:r>
-          </w:p>
-        </w:tc>
-        <w:tc>
-          <w:tcPr>
-            <w:tcW w:w="4508" w:type="dxa"/>
-            <w:shd w:val="clear" w:color="auto" w:fill="F1879B"/>
-          </w:tcPr>
-          <w:p>
-            <w:pPr>
-              <w:jc w:val="center"/>
-              <w:rPr>
-                <w:b/>
-                <w:bCs/>
-              </w:rPr>
-            </w:pPr>
-            <w:r>
-              <w:rPr>
-                <w:b/>
-                <w:bCs/>
-              </w:rPr>
-              <w:t>Risk</w:t>
-            </w:r>
-          </w:p>
-        </w:tc>
-      </w:tr>
-      <w:tr>
-        <w:tc>
-          <w:tcPr>
-            <w:tcW w:w="4508" w:type="dxa"/>
-          </w:tcPr>
-          <w:p>
-            <w:r>
-              <w:t>Exposed Network Services</w:t>
-            </w:r>
-          </w:p>
-        </w:tc>
-        <w:tc>
-          <w:tcPr>
-            <w:tcW w:w="4508" w:type="dxa"/>
-          </w:tcPr>
-          <w:p>
-            <w:r>
-              <w:t>Medium</w:t>
-            </w:r>
-          </w:p>
-        </w:tc>
-      </w:tr>
-      <w:tr>
-        <w:tc>
-          <w:tcPr>
-            <w:tcW w:w="4508" w:type="dxa"/>
-          </w:tcPr>
-          <w:p>
-            <w:r>
-              <w:t>Missing Content Security Policy</w:t>
-            </w:r>
-          </w:p>
-        </w:tc>
-        <w:tc>
-          <w:tcPr>
-            <w:tcW w:w="4508" w:type="dxa"/>
-          </w:tcPr>
-          <w:p>
-            <w:r>
-              <w:t>Medium</w:t>
-            </w:r>
-          </w:p>
-        </w:tc>
-      </w:tr>
-      <w:tr>
-        <w:tc>
-          <w:tcPr>
-            <w:tcW w:w="4508" w:type="dxa"/>
-          </w:tcPr>
-          <w:p>
-            <w:r>
-              <w:t>Website Accessible Over HTTP</w:t>
-            </w:r>
-          </w:p>
-        </w:tc>
-        <w:tc>
-          <w:tcPr>
-            <w:tcW w:w="4508" w:type="dxa"/>
-          </w:tcPr>
-          <w:p>
-            <w:r>
-              <w:t>Medium</w:t>
-            </w:r>
-          </w:p>
-        </w:tc>
-      </w:tr>
-      <w:tr>
-        <w:tc>
-          <w:tcPr>
-            <w:tcW w:w="4508" w:type="dxa"/>
-          </w:tcPr>
-          <w:p>
-            <w:r>
-              <w:t>Missing Referrer Policy</w:t>
-            </w:r>
-          </w:p>
-        </w:tc>
-        <w:tc>
-          <w:tcPr>
-            <w:tcW w:w="4508" w:type="dxa"/>
-          </w:tcPr>
-          <w:p>
-            <w:r>
-              <w:t>Low</w:t>
-            </w:r>
-          </w:p>
-        </w:tc>
-      </w:tr>
-      <w:tr>
-        <w:tc>
-          <w:tcPr>
-            <w:tcW w:w="4508" w:type="dxa"/>
-          </w:tcPr>
-          <w:p>
-            <w:r>
-              <w:t>Missing Permissions Policy</w:t>
-            </w:r>
-          </w:p>
-        </w:tc>
-        <w:tc>
-          <w:tcPr>
-            <w:tcW w:w="4508" w:type="dxa"/>
-          </w:tcPr>
-          <w:p>
-            <w:r>
-              <w:t>Low</w:t>
-            </w:r>
-          </w:p>
-        </w:tc>
-      </w:tr>
-    </w:tbl>
-    <w:p>
-      <w:pPr>
-        <w:pStyle w:val="Heading1"/>
-        <w:shd w:val="clear" w:color="auto" w:fill="FFC4C4"/>
-      </w:pPr>
-      <w:bookmarkStart w:id="8" w:name="_Toc233653142"/>
-      <w:r>
-        <w:t>Recommendations</w:t>
-      </w:r>
-      <w:bookmarkEnd w:id="8"/>
-    </w:p>
-    <w:p>
-      <w:r>
-        <w:t>To improve the application’s security posture, I would recommend:</w:t>
-      </w:r>
-    </w:p>
-    <w:p>
-      <w:pPr>
-        <w:pStyle w:val="ListParagraph"/>
-        <w:numPr>
-          <w:ilvl w:val="0"/>
-          <w:numId w:val="93"/>
-        </w:numPr>
-      </w:pPr>
-      <w:r>
-        <w:t>Remove or restrict unnecessary publicly exposed services.</w:t>
-      </w:r>
-    </w:p>
-    <w:p>
-      <w:pPr>
-        <w:pStyle w:val="ListParagraph"/>
-        <w:numPr>
-          <w:ilvl w:val="0"/>
-          <w:numId w:val="93"/>
-        </w:numPr>
-      </w:pPr>
-      <w:r>
-        <w:t>Implement a Content Security Policy.</w:t>
-      </w:r>
-    </w:p>
-    <w:p>
-      <w:pPr>
-        <w:pStyle w:val="ListParagraph"/>
-        <w:numPr>
-          <w:ilvl w:val="0"/>
-          <w:numId w:val="93"/>
-        </w:numPr>
-      </w:pPr>
-      <w:r>
-        <w:t>Configure a Referrer Policy.</w:t>
-      </w:r>
-    </w:p>
-    <w:p>
-      <w:pPr>
-        <w:pStyle w:val="ListParagraph"/>
-        <w:numPr>
-          <w:ilvl w:val="0"/>
-          <w:numId w:val="93"/>
-        </w:numPr>
-      </w:pPr>
-      <w:r>
-        <w:t>Configure a Permissions Policy.</w:t>
-      </w:r>
-    </w:p>
-    <w:p>
-      <w:pPr>
-        <w:pStyle w:val="ListParagraph"/>
-        <w:numPr>
-          <w:ilvl w:val="0"/>
-          <w:numId w:val="93"/>
-        </w:numPr>
-      </w:pPr>
-      <w:r>
-        <w:t>Redirect all HTTP requests to HTTPS.</w:t>
-      </w:r>
-    </w:p>
-    <w:p>
-      <w:pPr>
-        <w:pStyle w:val="ListParagraph"/>
-        <w:numPr>
-          <w:ilvl w:val="0"/>
-          <w:numId w:val="93"/>
-        </w:numPr>
-      </w:pPr>
-      <w:r>
-        <w:t>Continue performing regular vulnerability assessments.</w:t>
-      </w:r>
-    </w:p>
-    <w:p>
-      <w:pPr>
-        <w:pStyle w:val="ListParagraph"/>
-        <w:numPr>
-          <w:ilvl w:val="0"/>
-          <w:numId w:val="93"/>
-        </w:numPr>
-      </w:pPr>
-      <w:r>
-        <w:t>Keep server software updated.</w:t>
-      </w:r>
-    </w:p>
-    <w:p>
-      <w:pPr>
-        <w:pStyle w:val="ListParagraph"/>
-        <w:numPr>
-          <w:ilvl w:val="0"/>
-          <w:numId w:val="93"/>
-        </w:numPr>
-      </w:pPr>
-      <w:r>
-        <w:t>Review security configurations periodically.</w:t>
-      </w:r>
-    </w:p>
-    <w:p>
-      <w:pPr>
-        <w:pStyle w:val="Heading1"/>
-        <w:shd w:val="clear" w:color="auto" w:fill="FFC4C4"/>
-      </w:pPr>
-      <w:bookmarkStart w:id="9" w:name="_Toc233653143"/>
-      <w:r>
-        <w:t>Conclusion</w:t>
-      </w:r>
-      <w:bookmarkEnd w:id="9"/>
-    </w:p>
-    <w:p>
-      <w:r>
-        <w:t>A passive vulnerability assessment was conducted on the OWASP Juice Shop demo application using industry standard tools and ethical assessment techniques.</w:t>
-      </w:r>
-    </w:p>
-    <w:p>
-      <w:r>
-        <w:t>The assessment identified several medium and low risk security observations. The most significant findings were the presence of multiple exposed services, missing browser security headers, and the availability of the application over HTTP.</w:t>
-      </w:r>
-      <w:r>
-        <w:t xml:space="preserve"> </w:t>
-      </w:r>
-      <w:r>
-        <w:t>As the target</w:t>
-      </w:r>
-      <w:r>
-        <w:t xml:space="preserve"> website</w:t>
-      </w:r>
-      <w:r>
-        <w:t xml:space="preserve"> is an intentionally vulnerable training environment, these findings are expected and serve to demonstrate common web application security weaknesses.</w:t>
-      </w:r>
-    </w:p>
-    <w:p>
-      <w:r>
-        <w:t>Although the application implements certain security controls, including HTTPS support and selected browser security headers, additional hardening measures would further improve its overall security posture.</w:t>
-      </w:r>
-    </w:p>
-    <w:p>
-      <w:r>
-        <w:t xml:space="preserve">Implementing the recommended controls would reduce the application's attack surface and strengthen protection against common </w:t>
-      </w:r>
-      <w:r>
-        <w:t>web-based</w:t>
-      </w:r>
-      <w:r>
-        <w:t xml:space="preserve"> attacks.</w:t>
-      </w:r>
-    </w:p>
-    <w:p>
-      <w:pPr>
-        <w:pStyle w:val="Heading1"/>
-        <w:shd w:val="clear" w:color="auto" w:fill="FFC4C4"/>
-      </w:pPr>
-      <w:bookmarkStart w:id="10" w:name="_Toc233653144"/>
-      <w:r>
-        <w:lastRenderedPageBreak/>
-        <w:t>Appendix</w:t>
-      </w:r>
-      <w:bookmarkEnd w:id="10"/>
-    </w:p>
-    <w:p>
-      <w:pPr>
-        <w:keepNext/>
-      </w:pPr>
-      <w:r>
-        <w:rPr>
-          <w:noProof/>
-        </w:rPr>
         <w:drawing>
-          <wp:inline distT="0" distB="0" distL="0" distR="0" wp14:anchorId="0FA1C834" wp14:editId="2301347E">
-            <wp:extent cx="5731510" cy="6255385"/>
-            <wp:effectExtent l="0" t="0" r="2540" b="0"/>
-            <wp:docPr id="1444866663" name="Picture 5"/>
+          <wp:inline distT="0" distB="0" distL="0" distR="0" wp14:anchorId="25C25865" wp14:editId="172FB4B6">
+            <wp:extent cx="6645910" cy="2642235"/>
+            <wp:effectExtent l="0" t="0" r="2540" b="5715"/>
+            <wp:docPr id="1180015984" name="Picture 1"/>
             <wp:cNvGraphicFramePr>
               <a:graphicFrameLocks xmlns:a="http://schemas.openxmlformats.org/drawingml/2006/main" noChangeAspect="1"/>
             </wp:cNvGraphicFramePr>
@@ -3172,17 +942,11 @@
               <a:graphicData uri="http://schemas.openxmlformats.org/drawingml/2006/picture">
                 <pic:pic xmlns:pic="http://schemas.openxmlformats.org/drawingml/2006/picture">
                   <pic:nvPicPr>
-                    <pic:cNvPr id="1444866663" name="Picture 1444866663"/>
+                    <pic:cNvPr id="1180015984" name=""/>
                     <pic:cNvPicPr/>
                   </pic:nvPicPr>
                   <pic:blipFill>
-                    <a:blip r:embed="rId12">
-                      <a:extLst>
-                        <a:ext uri="{28A0092B-C50C-407E-A947-70E740481C1C}">
-                          <a14:useLocalDpi xmlns:a14="http://schemas.microsoft.com/office/drawing/2010/main" val="0"/>
-                        </a:ext>
-                      </a:extLst>
-                    </a:blip>
+                    <a:blip r:embed="rId9"/>
                     <a:stretch>
                       <a:fillRect/>
                     </a:stretch>
@@ -3190,7 +954,7 @@
                   <pic:spPr>
                     <a:xfrm>
                       <a:off x="0" y="0"/>
-                      <a:ext cx="5731510" cy="6255385"/>
+                      <a:ext cx="6645910" cy="2642235"/>
                     </a:xfrm>
                     <a:prstGeom prst="rect">
                       <a:avLst/>
@@ -3204,491 +968,11 @@
       </w:r>
     </w:p>
     <w:p>
-      <w:pPr>
-        <w:pStyle w:val="Caption"/>
-        <w:rPr>
-          <w:b/>
-          <w:bCs/>
-          <w:color w:val="7E1232" w:themeColor="accent2" w:themeShade="80"/>
-          <w:sz w:val="22"/>
-          <w:szCs w:val="22"/>
-        </w:rPr>
-      </w:pPr>
       <w:r>
-        <w:rPr>
-          <w:b/>
-          <w:bCs/>
-          <w:color w:val="7E1232" w:themeColor="accent2" w:themeShade="80"/>
-          <w:sz w:val="22"/>
-          <w:szCs w:val="22"/>
-        </w:rPr>
-        <w:t xml:space="preserve">Appendix </w:t>
-      </w:r>
-      <w:r>
-        <w:rPr>
-          <w:b/>
-          <w:bCs/>
-          <w:color w:val="7E1232" w:themeColor="accent2" w:themeShade="80"/>
-          <w:sz w:val="22"/>
-          <w:szCs w:val="22"/>
-        </w:rPr>
-        <w:fldChar w:fldCharType="begin"/>
-      </w:r>
-      <w:r>
-        <w:rPr>
-          <w:b/>
-          <w:bCs/>
-          <w:color w:val="7E1232" w:themeColor="accent2" w:themeShade="80"/>
-          <w:sz w:val="22"/>
-          <w:szCs w:val="22"/>
-        </w:rPr>
-        <w:instrText xml:space="preserve"> SEQ Appendix \* ALPHABETIC </w:instrText>
-      </w:r>
-      <w:r>
-        <w:rPr>
-          <w:b/>
-          <w:bCs/>
-          <w:color w:val="7E1232" w:themeColor="accent2" w:themeShade="80"/>
-          <w:sz w:val="22"/>
-          <w:szCs w:val="22"/>
-        </w:rPr>
-        <w:fldChar w:fldCharType="separate"/>
-      </w:r>
-      <w:r>
-        <w:rPr>
-          <w:b/>
-          <w:bCs/>
-          <w:noProof/>
-          <w:color w:val="7E1232" w:themeColor="accent2" w:themeShade="80"/>
-          <w:sz w:val="22"/>
-          <w:szCs w:val="22"/>
-        </w:rPr>
-        <w:t>A</w:t>
-      </w:r>
-      <w:r>
-        <w:rPr>
-          <w:b/>
-          <w:bCs/>
-          <w:color w:val="7E1232" w:themeColor="accent2" w:themeShade="80"/>
-          <w:sz w:val="22"/>
-          <w:szCs w:val="22"/>
-        </w:rPr>
-        <w:fldChar w:fldCharType="end"/>
-      </w:r>
-      <w:r>
-        <w:rPr>
-          <w:b/>
-          <w:bCs/>
-          <w:color w:val="7E1232" w:themeColor="accent2" w:themeShade="80"/>
-          <w:sz w:val="22"/>
-          <w:szCs w:val="22"/>
-        </w:rPr>
-        <w:t>: Header Scanner scr1</w:t>
+        <w:t>Defanged URL Link:</w:t>
       </w:r>
     </w:p>
-    <w:p>
-      <w:pPr>
-        <w:keepNext/>
-      </w:pPr>
-      <w:r>
-        <w:rPr>
-          <w:noProof/>
-        </w:rPr>
-        <w:lastRenderedPageBreak/>
-        <w:drawing>
-          <wp:inline distT="0" distB="0" distL="0" distR="0" wp14:anchorId="4116AD6B" wp14:editId="55F14526">
-            <wp:extent cx="5731510" cy="3141345"/>
-            <wp:effectExtent l="0" t="0" r="2540" b="1905"/>
-            <wp:docPr id="637331713" name="Picture 6"/>
-            <wp:cNvGraphicFramePr>
-              <a:graphicFrameLocks xmlns:a="http://schemas.openxmlformats.org/drawingml/2006/main" noChangeAspect="1"/>
-            </wp:cNvGraphicFramePr>
-            <a:graphic xmlns:a="http://schemas.openxmlformats.org/drawingml/2006/main">
-              <a:graphicData uri="http://schemas.openxmlformats.org/drawingml/2006/picture">
-                <pic:pic xmlns:pic="http://schemas.openxmlformats.org/drawingml/2006/picture">
-                  <pic:nvPicPr>
-                    <pic:cNvPr id="637331713" name="Picture 637331713"/>
-                    <pic:cNvPicPr/>
-                  </pic:nvPicPr>
-                  <pic:blipFill>
-                    <a:blip r:embed="rId13">
-                      <a:extLst>
-                        <a:ext uri="{28A0092B-C50C-407E-A947-70E740481C1C}">
-                          <a14:useLocalDpi xmlns:a14="http://schemas.microsoft.com/office/drawing/2010/main" val="0"/>
-                        </a:ext>
-                      </a:extLst>
-                    </a:blip>
-                    <a:stretch>
-                      <a:fillRect/>
-                    </a:stretch>
-                  </pic:blipFill>
-                  <pic:spPr>
-                    <a:xfrm>
-                      <a:off x="0" y="0"/>
-                      <a:ext cx="5731510" cy="3141345"/>
-                    </a:xfrm>
-                    <a:prstGeom prst="rect">
-                      <a:avLst/>
-                    </a:prstGeom>
-                  </pic:spPr>
-                </pic:pic>
-              </a:graphicData>
-            </a:graphic>
-          </wp:inline>
-        </w:drawing>
-      </w:r>
-    </w:p>
-    <w:p>
-      <w:pPr>
-        <w:pStyle w:val="Caption"/>
-        <w:rPr>
-          <w:b/>
-          <w:bCs/>
-          <w:color w:val="7E1232" w:themeColor="accent2" w:themeShade="80"/>
-          <w:sz w:val="22"/>
-          <w:szCs w:val="22"/>
-        </w:rPr>
-      </w:pPr>
-      <w:r>
-        <w:rPr>
-          <w:b/>
-          <w:bCs/>
-          <w:color w:val="7E1232" w:themeColor="accent2" w:themeShade="80"/>
-          <w:sz w:val="22"/>
-          <w:szCs w:val="22"/>
-        </w:rPr>
-        <w:t xml:space="preserve">Appendix </w:t>
-      </w:r>
-      <w:r>
-        <w:rPr>
-          <w:b/>
-          <w:bCs/>
-          <w:color w:val="7E1232" w:themeColor="accent2" w:themeShade="80"/>
-          <w:sz w:val="22"/>
-          <w:szCs w:val="22"/>
-        </w:rPr>
-        <w:fldChar w:fldCharType="begin"/>
-      </w:r>
-      <w:r>
-        <w:rPr>
-          <w:b/>
-          <w:bCs/>
-          <w:color w:val="7E1232" w:themeColor="accent2" w:themeShade="80"/>
-          <w:sz w:val="22"/>
-          <w:szCs w:val="22"/>
-        </w:rPr>
-        <w:instrText xml:space="preserve"> SEQ Appendix \* ALPHABETIC </w:instrText>
-      </w:r>
-      <w:r>
-        <w:rPr>
-          <w:b/>
-          <w:bCs/>
-          <w:color w:val="7E1232" w:themeColor="accent2" w:themeShade="80"/>
-          <w:sz w:val="22"/>
-          <w:szCs w:val="22"/>
-        </w:rPr>
-        <w:fldChar w:fldCharType="separate"/>
-      </w:r>
-      <w:r>
-        <w:rPr>
-          <w:b/>
-          <w:bCs/>
-          <w:noProof/>
-          <w:color w:val="7E1232" w:themeColor="accent2" w:themeShade="80"/>
-          <w:sz w:val="22"/>
-          <w:szCs w:val="22"/>
-        </w:rPr>
-        <w:t>B</w:t>
-      </w:r>
-      <w:r>
-        <w:rPr>
-          <w:b/>
-          <w:bCs/>
-          <w:color w:val="7E1232" w:themeColor="accent2" w:themeShade="80"/>
-          <w:sz w:val="22"/>
-          <w:szCs w:val="22"/>
-        </w:rPr>
-        <w:fldChar w:fldCharType="end"/>
-      </w:r>
-      <w:r>
-        <w:rPr>
-          <w:b/>
-          <w:bCs/>
-          <w:color w:val="7E1232" w:themeColor="accent2" w:themeShade="80"/>
-          <w:sz w:val="22"/>
-          <w:szCs w:val="22"/>
-        </w:rPr>
-        <w:t>: Header Scanner scr2</w:t>
-      </w:r>
-    </w:p>
-    <w:p>
-      <w:pPr>
-        <w:keepNext/>
-      </w:pPr>
-      <w:r>
-        <w:rPr>
-          <w:noProof/>
-        </w:rPr>
-        <w:drawing>
-          <wp:inline distT="0" distB="0" distL="0" distR="0" wp14:anchorId="40776D64" wp14:editId="45EA3140">
-            <wp:extent cx="5731510" cy="2136775"/>
-            <wp:effectExtent l="0" t="0" r="2540" b="0"/>
-            <wp:docPr id="1525470763" name="Picture 7"/>
-            <wp:cNvGraphicFramePr>
-              <a:graphicFrameLocks xmlns:a="http://schemas.openxmlformats.org/drawingml/2006/main" noChangeAspect="1"/>
-            </wp:cNvGraphicFramePr>
-            <a:graphic xmlns:a="http://schemas.openxmlformats.org/drawingml/2006/main">
-              <a:graphicData uri="http://schemas.openxmlformats.org/drawingml/2006/picture">
-                <pic:pic xmlns:pic="http://schemas.openxmlformats.org/drawingml/2006/picture">
-                  <pic:nvPicPr>
-                    <pic:cNvPr id="1525470763" name="Picture 1525470763"/>
-                    <pic:cNvPicPr/>
-                  </pic:nvPicPr>
-                  <pic:blipFill>
-                    <a:blip r:embed="rId14">
-                      <a:extLst>
-                        <a:ext uri="{28A0092B-C50C-407E-A947-70E740481C1C}">
-                          <a14:useLocalDpi xmlns:a14="http://schemas.microsoft.com/office/drawing/2010/main" val="0"/>
-                        </a:ext>
-                      </a:extLst>
-                    </a:blip>
-                    <a:stretch>
-                      <a:fillRect/>
-                    </a:stretch>
-                  </pic:blipFill>
-                  <pic:spPr>
-                    <a:xfrm>
-                      <a:off x="0" y="0"/>
-                      <a:ext cx="5731510" cy="2136775"/>
-                    </a:xfrm>
-                    <a:prstGeom prst="rect">
-                      <a:avLst/>
-                    </a:prstGeom>
-                  </pic:spPr>
-                </pic:pic>
-              </a:graphicData>
-            </a:graphic>
-          </wp:inline>
-        </w:drawing>
-      </w:r>
-    </w:p>
-    <w:p>
-      <w:pPr>
-        <w:pStyle w:val="Caption"/>
-        <w:rPr>
-          <w:b/>
-          <w:bCs/>
-          <w:color w:val="7E1232" w:themeColor="accent2" w:themeShade="80"/>
-          <w:sz w:val="22"/>
-          <w:szCs w:val="22"/>
-        </w:rPr>
-      </w:pPr>
-      <w:r>
-        <w:rPr>
-          <w:b/>
-          <w:bCs/>
-          <w:color w:val="7E1232" w:themeColor="accent2" w:themeShade="80"/>
-          <w:sz w:val="22"/>
-          <w:szCs w:val="22"/>
-        </w:rPr>
-        <w:t xml:space="preserve">Appendix </w:t>
-      </w:r>
-      <w:r>
-        <w:rPr>
-          <w:b/>
-          <w:bCs/>
-          <w:color w:val="7E1232" w:themeColor="accent2" w:themeShade="80"/>
-          <w:sz w:val="22"/>
-          <w:szCs w:val="22"/>
-        </w:rPr>
-        <w:fldChar w:fldCharType="begin"/>
-      </w:r>
-      <w:r>
-        <w:rPr>
-          <w:b/>
-          <w:bCs/>
-          <w:color w:val="7E1232" w:themeColor="accent2" w:themeShade="80"/>
-          <w:sz w:val="22"/>
-          <w:szCs w:val="22"/>
-        </w:rPr>
-        <w:instrText xml:space="preserve"> SEQ Appendix \* ALPHABETIC </w:instrText>
-      </w:r>
-      <w:r>
-        <w:rPr>
-          <w:b/>
-          <w:bCs/>
-          <w:color w:val="7E1232" w:themeColor="accent2" w:themeShade="80"/>
-          <w:sz w:val="22"/>
-          <w:szCs w:val="22"/>
-        </w:rPr>
-        <w:fldChar w:fldCharType="separate"/>
-      </w:r>
-      <w:r>
-        <w:rPr>
-          <w:b/>
-          <w:bCs/>
-          <w:noProof/>
-          <w:color w:val="7E1232" w:themeColor="accent2" w:themeShade="80"/>
-          <w:sz w:val="22"/>
-          <w:szCs w:val="22"/>
-        </w:rPr>
-        <w:t>C</w:t>
-      </w:r>
-      <w:r>
-        <w:rPr>
-          <w:b/>
-          <w:bCs/>
-          <w:color w:val="7E1232" w:themeColor="accent2" w:themeShade="80"/>
-          <w:sz w:val="22"/>
-          <w:szCs w:val="22"/>
-        </w:rPr>
-        <w:fldChar w:fldCharType="end"/>
-      </w:r>
-      <w:r>
-        <w:rPr>
-          <w:b/>
-          <w:bCs/>
-          <w:color w:val="7E1232" w:themeColor="accent2" w:themeShade="80"/>
-          <w:sz w:val="22"/>
-          <w:szCs w:val="22"/>
-        </w:rPr>
-        <w:t>: Nmap Network Scan</w:t>
-      </w:r>
-    </w:p>
-    <w:p>
-      <w:pPr>
-        <w:keepNext/>
-      </w:pPr>
-      <w:r>
-        <w:rPr>
-          <w:noProof/>
-        </w:rPr>
-        <w:drawing>
-          <wp:inline distT="0" distB="0" distL="0" distR="0" wp14:anchorId="275AAAB8" wp14:editId="3B4EA20D">
-            <wp:extent cx="4424155" cy="3153410"/>
-            <wp:effectExtent l="0" t="0" r="0" b="8890"/>
-            <wp:docPr id="2014647559" name="Picture 8"/>
-            <wp:cNvGraphicFramePr>
-              <a:graphicFrameLocks xmlns:a="http://schemas.openxmlformats.org/drawingml/2006/main" noChangeAspect="1"/>
-            </wp:cNvGraphicFramePr>
-            <a:graphic xmlns:a="http://schemas.openxmlformats.org/drawingml/2006/main">
-              <a:graphicData uri="http://schemas.openxmlformats.org/drawingml/2006/picture">
-                <pic:pic xmlns:pic="http://schemas.openxmlformats.org/drawingml/2006/picture">
-                  <pic:nvPicPr>
-                    <pic:cNvPr id="2014647559" name="Picture 2014647559"/>
-                    <pic:cNvPicPr/>
-                  </pic:nvPicPr>
-                  <pic:blipFill>
-                    <a:blip r:embed="rId11">
-                      <a:extLst>
-                        <a:ext uri="{28A0092B-C50C-407E-A947-70E740481C1C}">
-                          <a14:useLocalDpi xmlns:a14="http://schemas.microsoft.com/office/drawing/2010/main" val="0"/>
-                        </a:ext>
-                      </a:extLst>
-                    </a:blip>
-                    <a:stretch>
-                      <a:fillRect/>
-                    </a:stretch>
-                  </pic:blipFill>
-                  <pic:spPr>
-                    <a:xfrm>
-                      <a:off x="0" y="0"/>
-                      <a:ext cx="4440594" cy="3165128"/>
-                    </a:xfrm>
-                    <a:prstGeom prst="rect">
-                      <a:avLst/>
-                    </a:prstGeom>
-                  </pic:spPr>
-                </pic:pic>
-              </a:graphicData>
-            </a:graphic>
-          </wp:inline>
-        </w:drawing>
-      </w:r>
-    </w:p>
-    <w:p>
-      <w:pPr>
-        <w:pStyle w:val="Caption"/>
-        <w:rPr>
-          <w:b/>
-          <w:bCs/>
-          <w:color w:val="7E1232" w:themeColor="accent2" w:themeShade="80"/>
-          <w:sz w:val="22"/>
-          <w:szCs w:val="22"/>
-        </w:rPr>
-      </w:pPr>
-      <w:r>
-        <w:rPr>
-          <w:b/>
-          <w:bCs/>
-          <w:color w:val="7E1232" w:themeColor="accent2" w:themeShade="80"/>
-          <w:sz w:val="22"/>
-          <w:szCs w:val="22"/>
-        </w:rPr>
-        <w:t xml:space="preserve">Appendix </w:t>
-      </w:r>
-      <w:r>
-        <w:rPr>
-          <w:b/>
-          <w:bCs/>
-          <w:color w:val="7E1232" w:themeColor="accent2" w:themeShade="80"/>
-          <w:sz w:val="22"/>
-          <w:szCs w:val="22"/>
-        </w:rPr>
-        <w:fldChar w:fldCharType="begin"/>
-      </w:r>
-      <w:r>
-        <w:rPr>
-          <w:b/>
-          <w:bCs/>
-          <w:color w:val="7E1232" w:themeColor="accent2" w:themeShade="80"/>
-          <w:sz w:val="22"/>
-          <w:szCs w:val="22"/>
-        </w:rPr>
-        <w:instrText xml:space="preserve"> SEQ Appendix \* ALPHABETIC </w:instrText>
-      </w:r>
-      <w:r>
-        <w:rPr>
-          <w:b/>
-          <w:bCs/>
-          <w:color w:val="7E1232" w:themeColor="accent2" w:themeShade="80"/>
-          <w:sz w:val="22"/>
-          <w:szCs w:val="22"/>
-        </w:rPr>
-        <w:fldChar w:fldCharType="separate"/>
-      </w:r>
-      <w:r>
-        <w:rPr>
-          <w:b/>
-          <w:bCs/>
-          <w:noProof/>
-          <w:color w:val="7E1232" w:themeColor="accent2" w:themeShade="80"/>
-          <w:sz w:val="22"/>
-          <w:szCs w:val="22"/>
-        </w:rPr>
-        <w:t>D</w:t>
-      </w:r>
-      <w:r>
-        <w:rPr>
-          <w:b/>
-          <w:bCs/>
-          <w:color w:val="7E1232" w:themeColor="accent2" w:themeShade="80"/>
-          <w:sz w:val="22"/>
-          <w:szCs w:val="22"/>
-        </w:rPr>
-        <w:fldChar w:fldCharType="end"/>
-      </w:r>
-      <w:r>
-        <w:rPr>
-          <w:b/>
-          <w:bCs/>
-          <w:color w:val="7E1232" w:themeColor="accent2" w:themeShade="80"/>
-          <w:sz w:val="22"/>
-          <w:szCs w:val="22"/>
-        </w:rPr>
-        <w:t>: Security Headers Inspection</w:t>
-      </w:r>
-    </w:p>
+    <w:p/>
     <w:sectPr>
       <w:type w:val="continuous"/>
       <w:pgSz w:w="11906" w:h="16838"/>

</xml_diff>

<commit_message>
Create a folder "extra analysis"and added proof of analysis
</commit_message>
<xml_diff>
--- a/Task 2 Report.docx
+++ b/Task 2 Report.docx
@@ -928,49 +928,26 @@
         <w:t>Sample 1: Credit Union</w:t>
       </w:r>
     </w:p>
-    <w:p>
-      <w:r>
-        <w:drawing>
-          <wp:inline distT="0" distB="0" distL="0" distR="0" wp14:anchorId="25C25865" wp14:editId="172FB4B6">
-            <wp:extent cx="6645910" cy="2642235"/>
-            <wp:effectExtent l="0" t="0" r="2540" b="5715"/>
-            <wp:docPr id="1180015984" name="Picture 1"/>
-            <wp:cNvGraphicFramePr>
-              <a:graphicFrameLocks xmlns:a="http://schemas.openxmlformats.org/drawingml/2006/main" noChangeAspect="1"/>
-            </wp:cNvGraphicFramePr>
-            <a:graphic xmlns:a="http://schemas.openxmlformats.org/drawingml/2006/main">
-              <a:graphicData uri="http://schemas.openxmlformats.org/drawingml/2006/picture">
-                <pic:pic xmlns:pic="http://schemas.openxmlformats.org/drawingml/2006/picture">
-                  <pic:nvPicPr>
-                    <pic:cNvPr id="1180015984" name=""/>
-                    <pic:cNvPicPr/>
-                  </pic:nvPicPr>
-                  <pic:blipFill>
-                    <a:blip r:embed="rId9"/>
-                    <a:stretch>
-                      <a:fillRect/>
-                    </a:stretch>
-                  </pic:blipFill>
-                  <pic:spPr>
-                    <a:xfrm>
-                      <a:off x="0" y="0"/>
-                      <a:ext cx="6645910" cy="2642235"/>
-                    </a:xfrm>
-                    <a:prstGeom prst="rect">
-                      <a:avLst/>
-                    </a:prstGeom>
-                  </pic:spPr>
-                </pic:pic>
-              </a:graphicData>
-            </a:graphic>
-          </wp:inline>
-        </w:drawing>
-      </w:r>
-    </w:p>
+    <w:p/>
     <w:p>
       <w:r>
         <w:t>Defanged URL Link:</w:t>
       </w:r>
+    </w:p>
+    <w:p>
+      <w:proofErr w:type="spellStart"/>
+      <w:r>
+        <w:t>hxxp</w:t>
+      </w:r>
+      <w:proofErr w:type="spellEnd"/>
+      <w:r>
+        <w:t>[://]200[.]73[.]81[.]212/.CREDIT-UNION/</w:t>
+      </w:r>
+      <w:proofErr w:type="spellStart"/>
+      <w:r>
+        <w:t>update.php</w:t>
+      </w:r>
+      <w:proofErr w:type="spellEnd"/>
     </w:p>
     <w:p/>
     <w:sectPr>
@@ -12265,7 +12242,6 @@
   <w:style w:type="character" w:default="1" w:styleId="DefaultParagraphFont">
     <w:name w:val="Default Paragraph Font"/>
     <w:uiPriority w:val="1"/>
-    <w:semiHidden/>
     <w:unhideWhenUsed/>
   </w:style>
   <w:style w:type="table" w:default="1" w:styleId="TableNormal">

</xml_diff>

<commit_message>
Uploaded the virustotal screenshots for sample 2 and 3
</commit_message>
<xml_diff>
--- a/Task 2 Report.docx
+++ b/Task 2 Report.docx
@@ -1400,13 +1400,13 @@
       </w:tblPr>
       <w:tblGrid>
         <w:gridCol w:w="4339"/>
-        <w:gridCol w:w="3058"/>
-        <w:gridCol w:w="3059"/>
+        <w:gridCol w:w="4006"/>
+        <w:gridCol w:w="2111"/>
       </w:tblGrid>
       <w:tr>
         <w:tc>
           <w:tcPr>
-            <w:tcW w:w="3485" w:type="dxa"/>
+            <w:tcW w:w="4339" w:type="dxa"/>
           </w:tcPr>
           <w:p>
             <w:pPr>
@@ -1437,13 +1437,7 @@
               <w:t>Header Analysis</w:t>
             </w:r>
             <w:r>
-              <w:t xml:space="preserve"> using </w:t>
-            </w:r>
-            <w:r>
-              <w:t>Linux</w:t>
-            </w:r>
-            <w:r>
-              <w:t xml:space="preserve"> </w:t>
+              <w:t xml:space="preserve"> using Linux </w:t>
             </w:r>
           </w:p>
           <w:p>
@@ -1592,10 +1586,7 @@
           </w:p>
           <w:p>
             <w:r>
-              <w:t xml:space="preserve">The </w:t>
-            </w:r>
-            <w:r>
-              <w:t>displayed link shows “</w:t>
+              <w:t>The displayed link shows “</w:t>
             </w:r>
             <w:r>
               <w:t>My Online Banking</w:t>
@@ -1709,7 +1700,7 @@
           </w:p>
           <w:p>
             <w:r>
-              <w:t xml:space="preserve">The defanged URL was submitted to </w:t>
+              <w:t xml:space="preserve">The URL was submitted to </w:t>
             </w:r>
             <w:proofErr w:type="spellStart"/>
             <w:r>
@@ -1805,10 +1796,7 @@
           </w:p>
           <w:p>
             <w:r>
-              <w:t xml:space="preserve">We know this because </w:t>
-            </w:r>
-            <w:r>
-              <w:t>of:</w:t>
+              <w:t>We know this because of:</w:t>
             </w:r>
           </w:p>
           <w:p>
@@ -1913,11 +1901,7 @@
             </w:r>
             <w:proofErr w:type="spellEnd"/>
             <w:r>
-              <w:t xml:space="preserve"> did not identify the URL as malicious, analysing the email headers, message content, sender </w:t>
-            </w:r>
-            <w:r>
-              <w:lastRenderedPageBreak/>
-              <w:t>information and embedded link clearly revealed multiple phishing indicators.</w:t>
+              <w:t xml:space="preserve"> did not identify the URL as malicious, analysing the email headers, message content, sender information and embedded link clearly revealed multiple phishing indicators.</w:t>
             </w:r>
           </w:p>
           <w:p/>
@@ -1929,13 +1913,486 @@
         </w:tc>
         <w:tc>
           <w:tcPr>
-            <w:tcW w:w="3485" w:type="dxa"/>
+            <w:tcW w:w="3058" w:type="dxa"/>
           </w:tcPr>
+          <w:p>
+            <w:pPr>
+              <w:jc w:val="center"/>
+              <w:rPr>
+                <w:b/>
+                <w:bCs/>
+                <w:sz w:val="24"/>
+                <w:szCs w:val="24"/>
+              </w:rPr>
+            </w:pPr>
+            <w:r>
+              <w:rPr>
+                <w:b/>
+                <w:bCs/>
+                <w:sz w:val="24"/>
+                <w:szCs w:val="24"/>
+              </w:rPr>
+              <w:lastRenderedPageBreak/>
+              <w:t xml:space="preserve">Sample </w:t>
+            </w:r>
+            <w:r>
+              <w:rPr>
+                <w:b/>
+                <w:bCs/>
+                <w:sz w:val="24"/>
+                <w:szCs w:val="24"/>
+              </w:rPr>
+              <w:t>2</w:t>
+            </w:r>
+            <w:r>
+              <w:rPr>
+                <w:b/>
+                <w:bCs/>
+                <w:sz w:val="24"/>
+                <w:szCs w:val="24"/>
+              </w:rPr>
+              <w:t xml:space="preserve"> Analysis</w:t>
+            </w:r>
+          </w:p>
           <w:p/>
+          <w:p>
+            <w:pPr>
+              <w:pStyle w:val="Heading4"/>
+            </w:pPr>
+            <w:r>
+              <w:t>Header Analysis</w:t>
+            </w:r>
+            <w:r>
+              <w:t xml:space="preserve"> using Linux </w:t>
+            </w:r>
+          </w:p>
+          <w:p/>
+          <w:p>
+            <w:r>
+              <w:t>Findings:</w:t>
+            </w:r>
+          </w:p>
+          <w:p>
+            <w:pPr>
+              <w:pStyle w:val="ListParagraph"/>
+              <w:numPr>
+                <w:ilvl w:val="0"/>
+                <w:numId w:val="3"/>
+              </w:numPr>
+            </w:pPr>
+            <w:r>
+              <w:t xml:space="preserve">Three separate recipients were targeted simultaneously. </w:t>
+            </w:r>
+          </w:p>
+          <w:p>
+            <w:pPr>
+              <w:pStyle w:val="ListParagraph"/>
+              <w:numPr>
+                <w:ilvl w:val="0"/>
+                <w:numId w:val="3"/>
+              </w:numPr>
+            </w:pPr>
+            <w:proofErr w:type="spellStart"/>
+            <w:r>
+              <w:t>SpamAssassin</w:t>
+            </w:r>
+            <w:proofErr w:type="spellEnd"/>
+            <w:r>
+              <w:t xml:space="preserve"> flagged the email as spam with a score of 16.8, well above the threshold of 5.0.</w:t>
+            </w:r>
+          </w:p>
+          <w:p/>
+          <w:p>
+            <w:pPr>
+              <w:pStyle w:val="Heading5"/>
+            </w:pPr>
+            <w:r>
+              <w:t>Analysis</w:t>
+            </w:r>
+          </w:p>
+          <w:p>
+            <w:r>
+              <w:t>Although the sender appears to represent the National Credit Union Administration, replies would be sent to a different domain (cuna.org). This mismatch is unusual and should be treated as suspicious.</w:t>
+            </w:r>
+          </w:p>
+          <w:p/>
+          <w:p>
+            <w:r>
+              <w:t>The email was also sent to multiple recipients, indicating that it was likely part of a mass phishing campaign rather than a personalised communication.</w:t>
+            </w:r>
+          </w:p>
+          <w:p/>
+          <w:p>
+            <w:r>
+              <w:t xml:space="preserve">The high </w:t>
+            </w:r>
+            <w:proofErr w:type="spellStart"/>
+            <w:r>
+              <w:t>SpamAssassin</w:t>
+            </w:r>
+            <w:proofErr w:type="spellEnd"/>
+            <w:r>
+              <w:t xml:space="preserve"> score suggests that the email gateway identified several characteristics commonly associated with phishing emails.</w:t>
+            </w:r>
+          </w:p>
+          <w:p/>
+          <w:p>
+            <w:pPr>
+              <w:pStyle w:val="Heading4"/>
+            </w:pPr>
+            <w:r>
+              <w:t>Social Engineering Analysis</w:t>
+            </w:r>
+          </w:p>
+          <w:p>
+            <w:r>
+              <w:t>The email attempts to create urgency by informing the recipient that their account access has been limited until additional information is provided.</w:t>
+            </w:r>
+          </w:p>
+          <w:p/>
+          <w:p>
+            <w:r>
+              <w:t>It encourages the victim to click a verification link by suggesting that account functionality will remain restricted until action is taken.</w:t>
+            </w:r>
+          </w:p>
+          <w:p/>
+          <w:p>
+            <w:r>
+              <w:t>The inclusion of a case identification number makes the message appear more legitimate and attempts to increase the recipient's trust.</w:t>
+            </w:r>
+          </w:p>
+          <w:p>
+            <w:pPr>
+              <w:pStyle w:val="Heading4"/>
+            </w:pPr>
+            <w:r>
+              <w:t>URL Analysis</w:t>
+            </w:r>
+          </w:p>
+          <w:p>
+            <w:r>
+              <w:t>The displayed link shows “</w:t>
+            </w:r>
+            <w:r>
+              <w:t>My Online Banking</w:t>
+            </w:r>
+            <w:r>
+              <w:t xml:space="preserve">”. </w:t>
+            </w:r>
+          </w:p>
+          <w:p>
+            <w:pPr>
+              <w:rPr>
+                <w:b/>
+                <w:bCs/>
+              </w:rPr>
+            </w:pPr>
+            <w:r>
+              <w:t xml:space="preserve">The actual </w:t>
+            </w:r>
+            <w:proofErr w:type="spellStart"/>
+            <w:r>
+              <w:t>disticantion</w:t>
+            </w:r>
+            <w:proofErr w:type="spellEnd"/>
+            <w:r>
+              <w:t xml:space="preserve"> is </w:t>
+            </w:r>
+            <w:hyperlink r:id="rId11" w:history="1">
+              <w:r>
+                <w:rPr>
+                  <w:rStyle w:val="Hyperlink"/>
+                </w:rPr>
+                <w:t>http://200.73.81.212/.CREDIT-UNION/update.php</w:t>
+              </w:r>
+            </w:hyperlink>
+            <w:r>
+              <w:t xml:space="preserve">, and the </w:t>
+            </w:r>
+            <w:r>
+              <w:rPr>
+                <w:b/>
+                <w:bCs/>
+              </w:rPr>
+              <w:lastRenderedPageBreak/>
+              <w:t xml:space="preserve">defanged link created is </w:t>
+            </w:r>
+            <w:r>
+              <w:t>“</w:t>
+            </w:r>
+            <w:proofErr w:type="spellStart"/>
+            <w:r>
+              <w:t>hxxp</w:t>
+            </w:r>
+            <w:proofErr w:type="spellEnd"/>
+            <w:r>
+              <w:t>://200[.]73[.]81[.]212/.CREDIT-UNION/</w:t>
+            </w:r>
+            <w:proofErr w:type="spellStart"/>
+            <w:r>
+              <w:t>update.php</w:t>
+            </w:r>
+            <w:proofErr w:type="spellEnd"/>
+            <w:r>
+              <w:t>”</w:t>
+            </w:r>
+            <w:r>
+              <w:rPr>
+                <w:b/>
+                <w:bCs/>
+              </w:rPr>
+              <w:t xml:space="preserve"> </w:t>
+            </w:r>
+          </w:p>
+          <w:p>
+            <w:pPr>
+              <w:pStyle w:val="Heading5"/>
+            </w:pPr>
+            <w:r>
+              <w:t>Observations</w:t>
+            </w:r>
+          </w:p>
+          <w:p>
+            <w:r>
+              <w:t>The destination uses a raw IP address rather than an official banking domain.</w:t>
+            </w:r>
+          </w:p>
+          <w:p/>
+          <w:p>
+            <w:r>
+              <w:t>Legitimate financial institutions normally use HTTPS together with their registered domain names rather than numerical IP addresses.</w:t>
+            </w:r>
+          </w:p>
+          <w:p/>
+          <w:p>
+            <w:r>
+              <w:t>This is a common phishing indicator.</w:t>
+            </w:r>
+          </w:p>
+          <w:p/>
+          <w:p>
+            <w:pPr>
+              <w:pStyle w:val="Heading4"/>
+            </w:pPr>
+            <w:proofErr w:type="spellStart"/>
+            <w:r>
+              <w:t>VirusTotal</w:t>
+            </w:r>
+            <w:proofErr w:type="spellEnd"/>
+            <w:r>
+              <w:t xml:space="preserve"> Analysis</w:t>
+            </w:r>
+          </w:p>
+          <w:p>
+            <w:r>
+              <w:t xml:space="preserve">The URL was submitted to </w:t>
+            </w:r>
+            <w:proofErr w:type="spellStart"/>
+            <w:r>
+              <w:t>VirusTotal</w:t>
+            </w:r>
+            <w:proofErr w:type="spellEnd"/>
+            <w:r>
+              <w:t>.</w:t>
+            </w:r>
+          </w:p>
+          <w:p>
+            <w:r>
+              <w:t>At the time of analysis:</w:t>
+            </w:r>
+          </w:p>
+          <w:p>
+            <w:pPr>
+              <w:pStyle w:val="ListParagraph"/>
+              <w:numPr>
+                <w:ilvl w:val="0"/>
+                <w:numId w:val="4"/>
+              </w:numPr>
+            </w:pPr>
+            <w:r>
+              <w:t>No participating security vendors classified the URL as malicious.</w:t>
+            </w:r>
+          </w:p>
+          <w:p>
+            <w:pPr>
+              <w:pStyle w:val="ListParagraph"/>
+              <w:numPr>
+                <w:ilvl w:val="0"/>
+                <w:numId w:val="4"/>
+              </w:numPr>
+            </w:pPr>
+            <w:r>
+              <w:t>Several vendors returned an "Unrated" status.</w:t>
+            </w:r>
+          </w:p>
+          <w:p>
+            <w:pPr>
+              <w:pStyle w:val="ListParagraph"/>
+              <w:numPr>
+                <w:ilvl w:val="0"/>
+                <w:numId w:val="4"/>
+              </w:numPr>
+            </w:pPr>
+            <w:proofErr w:type="spellStart"/>
+            <w:r>
+              <w:t>VirusTotal</w:t>
+            </w:r>
+            <w:proofErr w:type="spellEnd"/>
+            <w:r>
+              <w:t xml:space="preserve"> could not successfully scan the website because the server did not respond.</w:t>
+            </w:r>
+          </w:p>
+          <w:p>
+            <w:r>
+              <w:t xml:space="preserve">Although </w:t>
+            </w:r>
+            <w:proofErr w:type="spellStart"/>
+            <w:r>
+              <w:t>VirusTotal</w:t>
+            </w:r>
+            <w:proofErr w:type="spellEnd"/>
+            <w:r>
+              <w:t xml:space="preserve"> did not detect the URL as malicious, the surrounding evidence strongly indicates that the email is a phishing attempt.</w:t>
+            </w:r>
+          </w:p>
+          <w:p/>
+          <w:p>
+            <w:r>
+              <w:t>This demonstrates an important cybersecurity principle stating that threat intelligence tools should support an investigation, not replace human judgement.</w:t>
+            </w:r>
+          </w:p>
+          <w:p/>
+          <w:p>
+            <w:pPr>
+              <w:pStyle w:val="Heading4"/>
+            </w:pPr>
+            <w:r>
+              <w:t xml:space="preserve"> </w:t>
+            </w:r>
+            <w:r>
+              <w:t>Classification: Phishing</w:t>
+            </w:r>
+          </w:p>
+          <w:p>
+            <w:r>
+              <w:t>We know this because of:</w:t>
+            </w:r>
+          </w:p>
+          <w:p>
+            <w:pPr>
+              <w:pStyle w:val="ListParagraph"/>
+              <w:numPr>
+                <w:ilvl w:val="0"/>
+                <w:numId w:val="5"/>
+              </w:numPr>
+            </w:pPr>
+            <w:r>
+              <w:t>Brand impersonation.</w:t>
+            </w:r>
+          </w:p>
+          <w:p>
+            <w:pPr>
+              <w:pStyle w:val="ListParagraph"/>
+              <w:numPr>
+                <w:ilvl w:val="0"/>
+                <w:numId w:val="5"/>
+              </w:numPr>
+            </w:pPr>
+            <w:r>
+              <w:t>Urgency designed to pressure the recipient.</w:t>
+            </w:r>
+          </w:p>
+          <w:p>
+            <w:pPr>
+              <w:pStyle w:val="ListParagraph"/>
+              <w:numPr>
+                <w:ilvl w:val="0"/>
+                <w:numId w:val="5"/>
+              </w:numPr>
+            </w:pPr>
+            <w:r>
+              <w:t>Suspicious Reply-To address.</w:t>
+            </w:r>
+          </w:p>
+          <w:p>
+            <w:pPr>
+              <w:pStyle w:val="ListParagraph"/>
+              <w:numPr>
+                <w:ilvl w:val="0"/>
+                <w:numId w:val="5"/>
+              </w:numPr>
+            </w:pPr>
+            <w:r>
+              <w:t>Multiple recipients.</w:t>
+            </w:r>
+          </w:p>
+          <w:p>
+            <w:pPr>
+              <w:pStyle w:val="ListParagraph"/>
+              <w:numPr>
+                <w:ilvl w:val="0"/>
+                <w:numId w:val="5"/>
+              </w:numPr>
+            </w:pPr>
+            <w:r>
+              <w:t>Raw IP address used instead of a trusted banking website.</w:t>
+            </w:r>
+          </w:p>
+          <w:p>
+            <w:pPr>
+              <w:pStyle w:val="ListParagraph"/>
+              <w:numPr>
+                <w:ilvl w:val="0"/>
+                <w:numId w:val="5"/>
+              </w:numPr>
+            </w:pPr>
+            <w:proofErr w:type="spellStart"/>
+            <w:r>
+              <w:t>SpamAssassin</w:t>
+            </w:r>
+            <w:proofErr w:type="spellEnd"/>
+            <w:r>
+              <w:t xml:space="preserve"> score significantly above the spam threshold.</w:t>
+            </w:r>
+          </w:p>
+          <w:p>
+            <w:pPr>
+              <w:pStyle w:val="Heading4"/>
+            </w:pPr>
+            <w:r>
+              <w:t>Lessons Learnt</w:t>
+            </w:r>
+          </w:p>
+          <w:p/>
+          <w:p>
+            <w:r>
+              <w:t>This sample demonstrated that phishing detection should never rely on a single indicator.</w:t>
+            </w:r>
+          </w:p>
+          <w:p/>
+          <w:p>
+            <w:r>
+              <w:t xml:space="preserve">Although </w:t>
+            </w:r>
+            <w:proofErr w:type="spellStart"/>
+            <w:r>
+              <w:t>VirusTotal</w:t>
+            </w:r>
+            <w:proofErr w:type="spellEnd"/>
+            <w:r>
+              <w:t xml:space="preserve"> did not identify the URL as malicious, analysing the email headers, message content, sender information and embedded link clearly revealed multiple phishing indicators.</w:t>
+            </w:r>
+          </w:p>
+          <w:p/>
+          <w:p>
+            <w:r>
+              <w:t>Combining technical analysis with human judgement provides a much more reliable assessment than relying solely on automated security tools.</w:t>
+            </w:r>
+          </w:p>
         </w:tc>
         <w:tc>
           <w:tcPr>
-            <w:tcW w:w="3486" w:type="dxa"/>
+            <w:tcW w:w="3059" w:type="dxa"/>
           </w:tcPr>
           <w:p/>
         </w:tc>
@@ -1943,19 +2400,19 @@
       <w:tr>
         <w:tc>
           <w:tcPr>
-            <w:tcW w:w="3485" w:type="dxa"/>
+            <w:tcW w:w="4339" w:type="dxa"/>
           </w:tcPr>
           <w:p/>
         </w:tc>
         <w:tc>
           <w:tcPr>
-            <w:tcW w:w="3485" w:type="dxa"/>
+            <w:tcW w:w="3058" w:type="dxa"/>
           </w:tcPr>
           <w:p/>
         </w:tc>
         <w:tc>
           <w:tcPr>
-            <w:tcW w:w="3486" w:type="dxa"/>
+            <w:tcW w:w="3059" w:type="dxa"/>
           </w:tcPr>
           <w:p/>
         </w:tc>
@@ -1963,19 +2420,19 @@
       <w:tr>
         <w:tc>
           <w:tcPr>
-            <w:tcW w:w="3485" w:type="dxa"/>
+            <w:tcW w:w="4339" w:type="dxa"/>
           </w:tcPr>
           <w:p/>
         </w:tc>
         <w:tc>
           <w:tcPr>
-            <w:tcW w:w="3485" w:type="dxa"/>
+            <w:tcW w:w="3058" w:type="dxa"/>
           </w:tcPr>
           <w:p/>
         </w:tc>
         <w:tc>
           <w:tcPr>
-            <w:tcW w:w="3486" w:type="dxa"/>
+            <w:tcW w:w="3059" w:type="dxa"/>
           </w:tcPr>
           <w:p/>
         </w:tc>
@@ -1983,19 +2440,19 @@
       <w:tr>
         <w:tc>
           <w:tcPr>
-            <w:tcW w:w="3485" w:type="dxa"/>
+            <w:tcW w:w="4339" w:type="dxa"/>
           </w:tcPr>
           <w:p/>
         </w:tc>
         <w:tc>
           <w:tcPr>
-            <w:tcW w:w="3485" w:type="dxa"/>
+            <w:tcW w:w="3058" w:type="dxa"/>
           </w:tcPr>
           <w:p/>
         </w:tc>
         <w:tc>
           <w:tcPr>
-            <w:tcW w:w="3486" w:type="dxa"/>
+            <w:tcW w:w="3059" w:type="dxa"/>
           </w:tcPr>
           <w:p/>
         </w:tc>
@@ -2003,19 +2460,19 @@
       <w:tr>
         <w:tc>
           <w:tcPr>
-            <w:tcW w:w="3485" w:type="dxa"/>
+            <w:tcW w:w="4339" w:type="dxa"/>
           </w:tcPr>
           <w:p/>
         </w:tc>
         <w:tc>
           <w:tcPr>
-            <w:tcW w:w="3485" w:type="dxa"/>
+            <w:tcW w:w="3058" w:type="dxa"/>
           </w:tcPr>
           <w:p/>
         </w:tc>
         <w:tc>
           <w:tcPr>
-            <w:tcW w:w="3486" w:type="dxa"/>
+            <w:tcW w:w="3059" w:type="dxa"/>
           </w:tcPr>
           <w:p/>
         </w:tc>

</xml_diff>